<commit_message>
Se hacen todos los documentos grupales - evidencias grupales
</commit_message>
<xml_diff>
--- a/Fase 2/Evidencias Proyecto/Documento 05 - Documento de Diseño.docx
+++ b/Fase 2/Evidencias Proyecto/Documento 05 - Documento de Diseño.docx
@@ -1,6 +1,6 @@
 
 <file path=word/document.xml><?xml version="1.0" encoding="utf-8"?>
-<w:document xmlns:wpc="http://schemas.microsoft.com/office/word/2010/wordprocessingCanvas" xmlns:cx="http://schemas.microsoft.com/office/drawing/2014/chartex" xmlns:cx1="http://schemas.microsoft.com/office/drawing/2015/9/8/chartex" xmlns:cx2="http://schemas.microsoft.com/office/drawing/2015/10/21/chartex" xmlns:cx3="http://schemas.microsoft.com/office/drawing/2016/5/9/chartex" xmlns:cx4="http://schemas.microsoft.com/office/drawing/2016/5/10/chartex" xmlns:cx5="http://schemas.microsoft.com/office/drawing/2016/5/11/chartex" xmlns:cx6="http://schemas.microsoft.com/office/drawing/2016/5/12/chartex" xmlns:cx7="http://schemas.microsoft.com/office/drawing/2016/5/13/chartex" xmlns:cx8="http://schemas.microsoft.com/office/drawing/2016/5/14/chartex" xmlns:mc="http://schemas.openxmlformats.org/markup-compatibility/2006" xmlns:m="http://schemas.openxmlformats.org/officeDocument/2006/math" xmlns:aink="http://schemas.microsoft.com/office/drawing/2016/ink" xmlns:am3d="http://schemas.microsoft.com/office/drawing/2017/model3d" xmlns:oel="http://schemas.microsoft.com/office/2019/extlst" xmlns:r="http://schemas.openxmlformats.org/officeDocument/2006/relationships" xmlns:wp14="http://schemas.microsoft.com/office/word/2010/wordprocessingDrawing" xmlns:wp="http://schemas.openxmlformats.org/drawingml/2006/wordprocessingDrawing" xmlns:wpg="http://schemas.microsoft.com/office/word/2010/wordprocessingGroup" xmlns:wpi="http://schemas.microsoft.com/office/word/2010/wordprocessingInk" xmlns:wps="http://schemas.microsoft.com/office/word/2010/wordprocessingShape" xmlns:o="urn:schemas-microsoft-com:office:office" xmlns:v="urn:schemas-microsoft-com:vml" xmlns:w10="urn:schemas-microsoft-com:office:word" xmlns:w="http://schemas.openxmlformats.org/wordprocessingml/2006/main" xmlns:w14="http://schemas.microsoft.com/office/word/2010/wordml" xmlns:w15="http://schemas.microsoft.com/office/word/2012/wordml" xmlns:w16cex="http://schemas.microsoft.com/office/word/2018/wordml/cex" xmlns:w16cid="http://schemas.microsoft.com/office/word/2016/wordml/cid" xmlns:w16="http://schemas.microsoft.com/office/word/2018/wordml" xmlns:w16sdtdh="http://schemas.microsoft.com/office/word/2020/wordml/sdtdatahash" xmlns:w16sdtfl="http://schemas.microsoft.com/office/word/2024/wordml/sdtformatlock" xmlns:w16se="http://schemas.microsoft.com/office/word/2015/wordml/symex" xmlns:w16du="http://schemas.microsoft.com/office/word/2023/wordml/word16du" xmlns:wne="http://schemas.microsoft.com/office/word/2006/wordml" mc:Ignorable="w14 w15 w16se w16cid w16 w16cex w16sdtdh w16sdtfl w16du wp14">
+<w:document xmlns:wpc="http://schemas.microsoft.com/office/word/2010/wordprocessingCanvas" xmlns:cx="http://schemas.microsoft.com/office/drawing/2014/chartex" xmlns:cx1="http://schemas.microsoft.com/office/drawing/2015/9/8/chartex" xmlns:cx2="http://schemas.microsoft.com/office/drawing/2015/10/21/chartex" xmlns:cx3="http://schemas.microsoft.com/office/drawing/2016/5/9/chartex" xmlns:cx4="http://schemas.microsoft.com/office/drawing/2016/5/10/chartex" xmlns:cx5="http://schemas.microsoft.com/office/drawing/2016/5/11/chartex" xmlns:cx6="http://schemas.microsoft.com/office/drawing/2016/5/12/chartex" xmlns:cx7="http://schemas.microsoft.com/office/drawing/2016/5/13/chartex" xmlns:cx8="http://schemas.microsoft.com/office/drawing/2016/5/14/chartex" xmlns:mc="http://schemas.openxmlformats.org/markup-compatibility/2006" xmlns:aink="http://schemas.microsoft.com/office/drawing/2016/ink" xmlns:am3d="http://schemas.microsoft.com/office/drawing/2017/model3d" xmlns:o="urn:schemas-microsoft-com:office:office" xmlns:oel="http://schemas.microsoft.com/office/2019/extlst" xmlns:r="http://schemas.openxmlformats.org/officeDocument/2006/relationships" xmlns:m="http://schemas.openxmlformats.org/officeDocument/2006/math" xmlns:v="urn:schemas-microsoft-com:vml" xmlns:wp14="http://schemas.microsoft.com/office/word/2010/wordprocessingDrawing" xmlns:wp="http://schemas.openxmlformats.org/drawingml/2006/wordprocessingDrawing" xmlns:w10="urn:schemas-microsoft-com:office:word" xmlns:w="http://schemas.openxmlformats.org/wordprocessingml/2006/main" xmlns:w14="http://schemas.microsoft.com/office/word/2010/wordml" xmlns:w15="http://schemas.microsoft.com/office/word/2012/wordml" xmlns:w16cex="http://schemas.microsoft.com/office/word/2018/wordml/cex" xmlns:w16cid="http://schemas.microsoft.com/office/word/2016/wordml/cid" xmlns:w16="http://schemas.microsoft.com/office/word/2018/wordml" xmlns:w16du="http://schemas.microsoft.com/office/word/2023/wordml/word16du" xmlns:w16sdtdh="http://schemas.microsoft.com/office/word/2020/wordml/sdtdatahash" xmlns:w16sdtfl="http://schemas.microsoft.com/office/word/2024/wordml/sdtformatlock" xmlns:w16se="http://schemas.microsoft.com/office/word/2015/wordml/symex" xmlns:wpg="http://schemas.microsoft.com/office/word/2010/wordprocessingGroup" xmlns:wpi="http://schemas.microsoft.com/office/word/2010/wordprocessingInk" xmlns:wne="http://schemas.microsoft.com/office/word/2006/wordml" xmlns:wps="http://schemas.microsoft.com/office/word/2010/wordprocessingShape" mc:Ignorable="w14 w15 w16se w16cid w16 w16cex w16sdtdh w16sdtfl w16du wp14">
   <w:body>
     <w:sdt>
       <w:sdtPr>
@@ -192,6 +192,7 @@
                       </w:rPr>
                       <w:t xml:space="preserve">Proyecto: </w:t>
                     </w:r>
+                    <w:proofErr w:type="spellStart"/>
                     <w:r>
                       <w:rPr>
                         <w:rFonts w:eastAsiaTheme="majorEastAsia" w:cstheme="minorHAnsi"/>
@@ -201,8 +202,9 @@
                         <w:szCs w:val="44"/>
                         <w:lang w:val="es-AR"/>
                       </w:rPr>
-                      <w:t>[Insertar Nombre de Proyecto]</w:t>
+                      <w:t>PortIA</w:t>
                     </w:r>
+                    <w:proofErr w:type="spellEnd"/>
                   </w:p>
                 </w:tc>
               </w:sdtContent>
@@ -313,9 +315,9 @@
                 </w:rPr>
                 <w:alias w:val="Fecha"/>
                 <w:id w:val="516659546"/>
-                <w:showingPlcHdr/>
                 <w:dataBinding w:prefixMappings="xmlns:ns0='http://schemas.microsoft.com/office/2006/coverPageProps'" w:xpath="/ns0:CoverPageProperties[1]/ns0:PublishDate[1]" w:storeItemID="{55AF091B-3C7A-41E3-B477-F2FDAA23CFDA}"/>
-                <w:date>
+                <w:date w:fullDate="2026-10-14T00:00:00Z">
+                  <w:dateFormat w:val="dd/MM/yyyy"/>
                   <w:lid w:val="es-ES"/>
                   <w:storeMappedDataAs w:val="dateTime"/>
                   <w:calendar w:val="gregorian"/>
@@ -342,9 +344,8 @@
                         <w:rFonts w:cstheme="minorHAnsi"/>
                         <w:b/>
                         <w:bCs/>
-                        <w:color w:val="FF0000"/>
                       </w:rPr>
-                      <w:t>[Seleccionar fecha]</w:t>
+                      <w:t>14/10/2026</w:t>
                     </w:r>
                   </w:p>
                 </w:tc>
@@ -1700,54 +1701,52 @@
         <w:trPr>
           <w:trHeight w:val="1134"/>
         </w:trPr>
-        <w:tc>
-          <w:tcPr>
-            <w:tcW w:w="1188" w:type="dxa"/>
-            <w:vAlign w:val="center"/>
-          </w:tcPr>
-          <w:p>
-            <w:pPr>
-              <w:jc w:val="both"/>
-              <w:rPr>
-                <w:rFonts w:asciiTheme="minorHAnsi" w:hAnsiTheme="minorHAnsi" w:cstheme="minorHAnsi"/>
-                <w:i/>
-                <w:color w:val="FF0000"/>
-                <w:szCs w:val="24"/>
-                <w:lang w:val="es-ES" w:eastAsia="es-ES"/>
-              </w:rPr>
-            </w:pPr>
-            <w:r>
-              <w:rPr>
-                <w:rFonts w:cstheme="minorHAnsi"/>
-                <w:i/>
-                <w:color w:val="FF0000"/>
-                <w:szCs w:val="24"/>
-                <w:lang w:val="es-ES" w:eastAsia="es-ES"/>
-              </w:rPr>
-              <w:fldChar w:fldCharType="begin"/>
-            </w:r>
-            <w:r>
-              <w:rPr>
-                <w:rFonts w:asciiTheme="minorHAnsi" w:hAnsiTheme="minorHAnsi" w:cstheme="minorHAnsi"/>
-                <w:i/>
-                <w:color w:val="FF0000"/>
-                <w:szCs w:val="24"/>
-                <w:lang w:val="es-ES" w:eastAsia="es-ES"/>
-              </w:rPr>
-              <w:instrText>MACROBUTTON NoMacro [Fecha]</w:instrText>
-            </w:r>
-            <w:r>
-              <w:rPr>
-                <w:rFonts w:cstheme="minorHAnsi"/>
-                <w:i/>
-                <w:color w:val="FF0000"/>
-                <w:szCs w:val="24"/>
-                <w:lang w:val="es-ES" w:eastAsia="es-ES"/>
-              </w:rPr>
-              <w:fldChar w:fldCharType="end"/>
-            </w:r>
-          </w:p>
-        </w:tc>
+        <w:sdt>
+          <w:sdtPr>
+            <w:rPr>
+              <w:rFonts w:cstheme="minorHAnsi"/>
+              <w:b/>
+              <w:bCs/>
+            </w:rPr>
+            <w:alias w:val="Fecha"/>
+            <w:id w:val="1934557384"/>
+            <w:dataBinding w:prefixMappings="xmlns:ns0='http://schemas.microsoft.com/office/2006/coverPageProps'" w:xpath="/ns0:CoverPageProperties[1]/ns0:PublishDate[1]" w:storeItemID="{55AF091B-3C7A-41E3-B477-F2FDAA23CFDA}"/>
+            <w:date w:fullDate="2026-10-14T00:00:00Z">
+              <w:dateFormat w:val="dd/MM/yyyy"/>
+              <w:lid w:val="es-ES"/>
+              <w:storeMappedDataAs w:val="dateTime"/>
+              <w:calendar w:val="gregorian"/>
+            </w:date>
+          </w:sdtPr>
+          <w:sdtContent>
+            <w:tc>
+              <w:tcPr>
+                <w:tcW w:w="1188" w:type="dxa"/>
+                <w:vAlign w:val="center"/>
+              </w:tcPr>
+              <w:p>
+                <w:pPr>
+                  <w:jc w:val="both"/>
+                  <w:rPr>
+                    <w:rFonts w:asciiTheme="minorHAnsi" w:hAnsiTheme="minorHAnsi" w:cstheme="minorHAnsi"/>
+                    <w:i/>
+                    <w:color w:val="FF0000"/>
+                    <w:szCs w:val="24"/>
+                    <w:lang w:val="es-ES" w:eastAsia="es-ES"/>
+                  </w:rPr>
+                </w:pPr>
+                <w:r>
+                  <w:rPr>
+                    <w:rFonts w:cstheme="minorHAnsi"/>
+                    <w:b/>
+                    <w:bCs/>
+                  </w:rPr>
+                  <w:t>14/10/2026</w:t>
+                </w:r>
+              </w:p>
+            </w:tc>
+          </w:sdtContent>
+        </w:sdt>
         <w:tc>
           <w:tcPr>
             <w:tcW w:w="1080" w:type="dxa"/>
@@ -1772,27 +1771,7 @@
                 <w:szCs w:val="24"/>
                 <w:lang w:val="es-ES" w:eastAsia="es-ES"/>
               </w:rPr>
-              <w:fldChar w:fldCharType="begin"/>
-            </w:r>
-            <w:r>
-              <w:rPr>
-                <w:rFonts w:asciiTheme="minorHAnsi" w:hAnsiTheme="minorHAnsi" w:cstheme="minorHAnsi"/>
-                <w:i/>
-                <w:color w:val="FF0000"/>
-                <w:szCs w:val="24"/>
-                <w:lang w:val="es-ES" w:eastAsia="es-ES"/>
-              </w:rPr>
-              <w:instrText>MACROBUTTON NoMacro [Rev]</w:instrText>
-            </w:r>
-            <w:r>
-              <w:rPr>
-                <w:rFonts w:cstheme="minorHAnsi"/>
-                <w:i/>
-                <w:color w:val="FF0000"/>
-                <w:szCs w:val="24"/>
-                <w:lang w:val="es-ES" w:eastAsia="es-ES"/>
-              </w:rPr>
-              <w:fldChar w:fldCharType="end"/>
+              <w:t>Revisión 1</w:t>
             </w:r>
           </w:p>
         </w:tc>
@@ -1820,18 +1799,9 @@
                 <w:szCs w:val="24"/>
                 <w:lang w:val="es-ES" w:eastAsia="es-ES"/>
               </w:rPr>
-              <w:fldChar w:fldCharType="begin"/>
-            </w:r>
-            <w:r>
-              <w:rPr>
-                <w:rFonts w:asciiTheme="minorHAnsi" w:hAnsiTheme="minorHAnsi" w:cstheme="minorHAnsi"/>
-                <w:i/>
-                <w:color w:val="FF0000"/>
-                <w:szCs w:val="24"/>
-                <w:lang w:val="es-ES" w:eastAsia="es-ES"/>
-              </w:rPr>
-              <w:instrText>MACROBUTTON NoMacro [Descripcion]</w:instrText>
-            </w:r>
+              <w:t xml:space="preserve">Nicolas Soto, Ignacio Andrade y Airon </w:t>
+            </w:r>
+            <w:proofErr w:type="spellStart"/>
             <w:r>
               <w:rPr>
                 <w:rFonts w:cstheme="minorHAnsi"/>
@@ -1840,8 +1810,9 @@
                 <w:szCs w:val="24"/>
                 <w:lang w:val="es-ES" w:eastAsia="es-ES"/>
               </w:rPr>
-              <w:fldChar w:fldCharType="end"/>
-            </w:r>
+              <w:t>Saez</w:t>
+            </w:r>
+            <w:proofErr w:type="spellEnd"/>
           </w:p>
         </w:tc>
         <w:tc>
@@ -1868,27 +1839,7 @@
                 <w:szCs w:val="24"/>
                 <w:lang w:val="es-ES" w:eastAsia="es-ES"/>
               </w:rPr>
-              <w:fldChar w:fldCharType="begin"/>
-            </w:r>
-            <w:r>
-              <w:rPr>
-                <w:rFonts w:asciiTheme="minorHAnsi" w:hAnsiTheme="minorHAnsi" w:cstheme="minorHAnsi"/>
-                <w:i/>
-                <w:color w:val="FF0000"/>
-                <w:szCs w:val="24"/>
-                <w:lang w:val="es-ES" w:eastAsia="es-ES"/>
-              </w:rPr>
-              <w:instrText>MACROBUTTON NoMacro [Descripcion]</w:instrText>
-            </w:r>
-            <w:r>
-              <w:rPr>
-                <w:rFonts w:cstheme="minorHAnsi"/>
-                <w:i/>
-                <w:color w:val="FF0000"/>
-                <w:szCs w:val="24"/>
-                <w:lang w:val="es-ES" w:eastAsia="es-ES"/>
-              </w:rPr>
-              <w:fldChar w:fldCharType="end"/>
+              <w:t>Primera revisión de documento</w:t>
             </w:r>
           </w:p>
         </w:tc>
@@ -2315,6 +2266,15 @@
                 <w:lang w:val="es-ES" w:eastAsia="es-ES"/>
               </w:rPr>
             </w:pPr>
+            <w:r>
+              <w:rPr>
+                <w:rFonts w:asciiTheme="minorHAnsi" w:hAnsiTheme="minorHAnsi" w:cstheme="minorHAnsi"/>
+                <w:i/>
+                <w:szCs w:val="24"/>
+                <w:lang w:val="es-ES" w:eastAsia="es-ES"/>
+              </w:rPr>
+              <w:t>Ignacio Andrade</w:t>
+            </w:r>
           </w:p>
         </w:tc>
         <w:tc>
@@ -2332,6 +2292,26 @@
                 <w:lang w:val="es-ES" w:eastAsia="es-ES"/>
               </w:rPr>
             </w:pPr>
+            <w:r>
+              <w:rPr>
+                <w:rFonts w:asciiTheme="minorHAnsi" w:hAnsiTheme="minorHAnsi" w:cstheme="minorHAnsi"/>
+                <w:i/>
+                <w:szCs w:val="24"/>
+                <w:lang w:val="es-ES" w:eastAsia="es-ES"/>
+              </w:rPr>
+              <w:t xml:space="preserve">Desarrollador full </w:t>
+            </w:r>
+            <w:proofErr w:type="spellStart"/>
+            <w:r>
+              <w:rPr>
+                <w:rFonts w:asciiTheme="minorHAnsi" w:hAnsiTheme="minorHAnsi" w:cstheme="minorHAnsi"/>
+                <w:i/>
+                <w:szCs w:val="24"/>
+                <w:lang w:val="es-ES" w:eastAsia="es-ES"/>
+              </w:rPr>
+              <w:t>stack</w:t>
+            </w:r>
+            <w:proofErr w:type="spellEnd"/>
           </w:p>
         </w:tc>
       </w:tr>
@@ -2354,6 +2334,16 @@
                 <w:lang w:val="es-ES" w:eastAsia="es-ES"/>
               </w:rPr>
             </w:pPr>
+            <w:r>
+              <w:rPr>
+                <w:rFonts w:cstheme="minorHAnsi"/>
+                <w:i/>
+                <w:szCs w:val="24"/>
+                <w:lang w:val="es-ES" w:eastAsia="es-ES"/>
+              </w:rPr>
+              <w:lastRenderedPageBreak/>
+              <w:t>Nicolas Soto</w:t>
+            </w:r>
           </w:p>
         </w:tc>
         <w:tc>
@@ -2371,6 +2361,26 @@
                 <w:lang w:val="es-ES" w:eastAsia="es-ES"/>
               </w:rPr>
             </w:pPr>
+            <w:r>
+              <w:rPr>
+                <w:rFonts w:asciiTheme="minorHAnsi" w:hAnsiTheme="minorHAnsi" w:cstheme="minorHAnsi"/>
+                <w:i/>
+                <w:szCs w:val="24"/>
+                <w:lang w:val="es-ES" w:eastAsia="es-ES"/>
+              </w:rPr>
+              <w:t xml:space="preserve">Desarrollador full </w:t>
+            </w:r>
+            <w:proofErr w:type="spellStart"/>
+            <w:r>
+              <w:rPr>
+                <w:rFonts w:asciiTheme="minorHAnsi" w:hAnsiTheme="minorHAnsi" w:cstheme="minorHAnsi"/>
+                <w:i/>
+                <w:szCs w:val="24"/>
+                <w:lang w:val="es-ES" w:eastAsia="es-ES"/>
+              </w:rPr>
+              <w:t>stack</w:t>
+            </w:r>
+            <w:proofErr w:type="spellEnd"/>
           </w:p>
         </w:tc>
       </w:tr>
@@ -2393,6 +2403,26 @@
                 <w:lang w:val="es-ES" w:eastAsia="es-ES"/>
               </w:rPr>
             </w:pPr>
+            <w:r>
+              <w:rPr>
+                <w:rFonts w:cstheme="minorHAnsi"/>
+                <w:i/>
+                <w:szCs w:val="24"/>
+                <w:lang w:val="es-ES" w:eastAsia="es-ES"/>
+              </w:rPr>
+              <w:t xml:space="preserve">Airon </w:t>
+            </w:r>
+            <w:proofErr w:type="spellStart"/>
+            <w:r>
+              <w:rPr>
+                <w:rFonts w:cstheme="minorHAnsi"/>
+                <w:i/>
+                <w:szCs w:val="24"/>
+                <w:lang w:val="es-ES" w:eastAsia="es-ES"/>
+              </w:rPr>
+              <w:t>Saez</w:t>
+            </w:r>
+            <w:proofErr w:type="spellEnd"/>
           </w:p>
         </w:tc>
         <w:tc>
@@ -2410,84 +2440,26 @@
                 <w:lang w:val="es-ES" w:eastAsia="es-ES"/>
               </w:rPr>
             </w:pPr>
-          </w:p>
-        </w:tc>
-      </w:tr>
-      <w:tr>
-        <w:trPr>
-          <w:trHeight w:val="465"/>
-        </w:trPr>
-        <w:tc>
-          <w:tcPr>
-            <w:tcW w:w="3539" w:type="dxa"/>
-            <w:vAlign w:val="center"/>
-          </w:tcPr>
-          <w:p>
-            <w:pPr>
-              <w:jc w:val="both"/>
-              <w:rPr>
-                <w:rFonts w:cstheme="minorHAnsi"/>
+            <w:r>
+              <w:rPr>
+                <w:rFonts w:asciiTheme="minorHAnsi" w:hAnsiTheme="minorHAnsi" w:cstheme="minorHAnsi"/>
                 <w:i/>
                 <w:szCs w:val="24"/>
                 <w:lang w:val="es-ES" w:eastAsia="es-ES"/>
               </w:rPr>
-            </w:pPr>
-          </w:p>
-        </w:tc>
-        <w:tc>
-          <w:tcPr>
-            <w:tcW w:w="5275" w:type="dxa"/>
-            <w:vAlign w:val="center"/>
-          </w:tcPr>
-          <w:p>
-            <w:pPr>
-              <w:jc w:val="both"/>
-              <w:rPr>
-                <w:rFonts w:cstheme="minorHAnsi"/>
+              <w:t xml:space="preserve">Desarrollador full </w:t>
+            </w:r>
+            <w:proofErr w:type="spellStart"/>
+            <w:r>
+              <w:rPr>
+                <w:rFonts w:asciiTheme="minorHAnsi" w:hAnsiTheme="minorHAnsi" w:cstheme="minorHAnsi"/>
                 <w:i/>
                 <w:szCs w:val="24"/>
                 <w:lang w:val="es-ES" w:eastAsia="es-ES"/>
               </w:rPr>
-            </w:pPr>
-          </w:p>
-        </w:tc>
-      </w:tr>
-      <w:tr>
-        <w:trPr>
-          <w:trHeight w:val="465"/>
-        </w:trPr>
-        <w:tc>
-          <w:tcPr>
-            <w:tcW w:w="3539" w:type="dxa"/>
-            <w:vAlign w:val="center"/>
-          </w:tcPr>
-          <w:p>
-            <w:pPr>
-              <w:jc w:val="both"/>
-              <w:rPr>
-                <w:rFonts w:cstheme="minorHAnsi"/>
-                <w:i/>
-                <w:szCs w:val="24"/>
-                <w:lang w:val="es-ES" w:eastAsia="es-ES"/>
-              </w:rPr>
-            </w:pPr>
-          </w:p>
-        </w:tc>
-        <w:tc>
-          <w:tcPr>
-            <w:tcW w:w="5275" w:type="dxa"/>
-            <w:vAlign w:val="center"/>
-          </w:tcPr>
-          <w:p>
-            <w:pPr>
-              <w:jc w:val="both"/>
-              <w:rPr>
-                <w:rFonts w:cstheme="minorHAnsi"/>
-                <w:i/>
-                <w:szCs w:val="24"/>
-                <w:lang w:val="es-ES" w:eastAsia="es-ES"/>
-              </w:rPr>
-            </w:pPr>
+              <w:t>stack</w:t>
+            </w:r>
+            <w:proofErr w:type="spellEnd"/>
           </w:p>
         </w:tc>
       </w:tr>
@@ -2514,34 +2486,16 @@
     </w:p>
     <w:p>
       <w:pPr>
-        <w:rPr>
-          <w:rFonts w:cstheme="minorHAnsi"/>
-          <w:b/>
-        </w:rPr>
-      </w:pPr>
-      <w:r>
-        <w:rPr>
-          <w:rFonts w:cstheme="minorHAnsi"/>
-          <w:b/>
-        </w:rPr>
-        <w:lastRenderedPageBreak/>
-        <w:br w:type="page"/>
-      </w:r>
-    </w:p>
-    <w:p>
-      <w:pPr>
-        <w:jc w:val="both"/>
-        <w:rPr>
-          <w:lang w:val="es-ES" w:eastAsia="es-ES"/>
-        </w:rPr>
-      </w:pPr>
-    </w:p>
-    <w:p>
-      <w:pPr>
         <w:pStyle w:val="Ttulo1"/>
+        <w:numPr>
+          <w:ilvl w:val="0"/>
+          <w:numId w:val="0"/>
+        </w:numPr>
+        <w:ind w:left="432" w:hanging="432"/>
       </w:pPr>
       <w:bookmarkStart w:id="3" w:name="_Toc241504832"/>
       <w:r>
+        <w:lastRenderedPageBreak/>
         <w:t>Diseño</w:t>
       </w:r>
       <w:bookmarkEnd w:id="3"/>
@@ -2557,13 +2511,55 @@
       </w:r>
       <w:bookmarkEnd w:id="4"/>
     </w:p>
-    <w:p/>
+    <w:p>
+      <w:r>
+        <w:rPr>
+          <w:noProof/>
+        </w:rPr>
+        <w:drawing>
+          <wp:inline distT="0" distB="0" distL="0" distR="0" wp14:anchorId="710661CE" wp14:editId="4A227BE0">
+            <wp:extent cx="5612130" cy="4450715"/>
+            <wp:effectExtent l="0" t="0" r="0" b="0"/>
+            <wp:docPr id="782337210" name="Imagen 9"/>
+            <wp:cNvGraphicFramePr>
+              <a:graphicFrameLocks xmlns:a="http://schemas.openxmlformats.org/drawingml/2006/main" noChangeAspect="1"/>
+            </wp:cNvGraphicFramePr>
+            <a:graphic xmlns:a="http://schemas.openxmlformats.org/drawingml/2006/main">
+              <a:graphicData uri="http://schemas.openxmlformats.org/drawingml/2006/picture">
+                <pic:pic xmlns:pic="http://schemas.openxmlformats.org/drawingml/2006/picture">
+                  <pic:nvPicPr>
+                    <pic:cNvPr id="782337210" name="Imagen 782337210"/>
+                    <pic:cNvPicPr/>
+                  </pic:nvPicPr>
+                  <pic:blipFill>
+                    <a:blip r:embed="rId12"/>
+                    <a:stretch>
+                      <a:fillRect/>
+                    </a:stretch>
+                  </pic:blipFill>
+                  <pic:spPr>
+                    <a:xfrm>
+                      <a:off x="0" y="0"/>
+                      <a:ext cx="5612130" cy="4450715"/>
+                    </a:xfrm>
+                    <a:prstGeom prst="rect">
+                      <a:avLst/>
+                    </a:prstGeom>
+                  </pic:spPr>
+                </pic:pic>
+              </a:graphicData>
+            </a:graphic>
+          </wp:inline>
+        </w:drawing>
+      </w:r>
+    </w:p>
     <w:p>
       <w:pPr>
         <w:pStyle w:val="Ttulo2"/>
       </w:pPr>
       <w:bookmarkStart w:id="5" w:name="_Toc241504834"/>
       <w:r>
+        <w:lastRenderedPageBreak/>
         <w:t>Vista Lógica</w:t>
       </w:r>
       <w:bookmarkEnd w:id="5"/>
@@ -2584,6 +2580,47 @@
           <w:lang w:val="es-ES" w:eastAsia="es-ES"/>
         </w:rPr>
       </w:pPr>
+      <w:r>
+        <w:rPr>
+          <w:noProof/>
+          <w:lang w:val="es-ES" w:eastAsia="es-ES"/>
+        </w:rPr>
+        <w:drawing>
+          <wp:inline distT="0" distB="0" distL="0" distR="0" wp14:anchorId="4B479A5E" wp14:editId="508FC201">
+            <wp:extent cx="5612130" cy="2446020"/>
+            <wp:effectExtent l="0" t="0" r="0" b="0"/>
+            <wp:docPr id="376204456" name="Imagen 6"/>
+            <wp:cNvGraphicFramePr>
+              <a:graphicFrameLocks xmlns:a="http://schemas.openxmlformats.org/drawingml/2006/main" noChangeAspect="1"/>
+            </wp:cNvGraphicFramePr>
+            <a:graphic xmlns:a="http://schemas.openxmlformats.org/drawingml/2006/main">
+              <a:graphicData uri="http://schemas.openxmlformats.org/drawingml/2006/picture">
+                <pic:pic xmlns:pic="http://schemas.openxmlformats.org/drawingml/2006/picture">
+                  <pic:nvPicPr>
+                    <pic:cNvPr id="376204456" name="Imagen 376204456"/>
+                    <pic:cNvPicPr/>
+                  </pic:nvPicPr>
+                  <pic:blipFill>
+                    <a:blip r:embed="rId13"/>
+                    <a:stretch>
+                      <a:fillRect/>
+                    </a:stretch>
+                  </pic:blipFill>
+                  <pic:spPr>
+                    <a:xfrm>
+                      <a:off x="0" y="0"/>
+                      <a:ext cx="5612130" cy="2446020"/>
+                    </a:xfrm>
+                    <a:prstGeom prst="rect">
+                      <a:avLst/>
+                    </a:prstGeom>
+                  </pic:spPr>
+                </pic:pic>
+              </a:graphicData>
+            </a:graphic>
+          </wp:inline>
+        </w:drawing>
+      </w:r>
     </w:p>
     <w:p>
       <w:pPr>
@@ -2595,13 +2632,91 @@
       </w:r>
       <w:bookmarkEnd w:id="7"/>
     </w:p>
-    <w:p/>
+    <w:p>
+      <w:r>
+        <w:rPr>
+          <w:noProof/>
+        </w:rPr>
+        <w:drawing>
+          <wp:inline distT="0" distB="0" distL="0" distR="0" wp14:anchorId="0B2C5DCF" wp14:editId="448F0460">
+            <wp:extent cx="5612130" cy="3103245"/>
+            <wp:effectExtent l="0" t="0" r="0" b="0"/>
+            <wp:docPr id="103564753" name="Imagen 3"/>
+            <wp:cNvGraphicFramePr>
+              <a:graphicFrameLocks xmlns:a="http://schemas.openxmlformats.org/drawingml/2006/main" noChangeAspect="1"/>
+            </wp:cNvGraphicFramePr>
+            <a:graphic xmlns:a="http://schemas.openxmlformats.org/drawingml/2006/main">
+              <a:graphicData uri="http://schemas.openxmlformats.org/drawingml/2006/picture">
+                <pic:pic xmlns:pic="http://schemas.openxmlformats.org/drawingml/2006/picture">
+                  <pic:nvPicPr>
+                    <pic:cNvPr id="103564753" name="Imagen 103564753"/>
+                    <pic:cNvPicPr/>
+                  </pic:nvPicPr>
+                  <pic:blipFill>
+                    <a:blip r:embed="rId14"/>
+                    <a:stretch>
+                      <a:fillRect/>
+                    </a:stretch>
+                  </pic:blipFill>
+                  <pic:spPr>
+                    <a:xfrm>
+                      <a:off x="0" y="0"/>
+                      <a:ext cx="5612130" cy="3103245"/>
+                    </a:xfrm>
+                    <a:prstGeom prst="rect">
+                      <a:avLst/>
+                    </a:prstGeom>
+                  </pic:spPr>
+                </pic:pic>
+              </a:graphicData>
+            </a:graphic>
+          </wp:inline>
+        </w:drawing>
+      </w:r>
+      <w:r>
+        <w:fldChar w:fldCharType="begin"/>
+      </w:r>
+      <w:r>
+        <w:instrText xml:space="preserve"> INCLUDEPICTURE "https://lh3.google.com/u/1/d/1c0k9qW1T4PsCicRm6Lz6d9fg0VfbJ-VC=w1878-h923-iv1?auditContext=prefetch" \* MERGEFORMATINET </w:instrText>
+      </w:r>
+      <w:r>
+        <w:fldChar w:fldCharType="separate"/>
+      </w:r>
+      <w:r>
+        <w:pict w14:anchorId="787150A6">
+          <v:shapetype id="_x0000_t75" coordsize="21600,21600" o:spt="75" o:preferrelative="t" path="m@4@5l@4@11@9@11@9@5xe" filled="f" stroked="f">
+            <v:stroke joinstyle="miter"/>
+            <v:formulas>
+              <v:f eqn="if lineDrawn pixelLineWidth 0"/>
+              <v:f eqn="sum @0 1 0"/>
+              <v:f eqn="sum 0 0 @1"/>
+              <v:f eqn="prod @2 1 2"/>
+              <v:f eqn="prod @3 21600 pixelWidth"/>
+              <v:f eqn="prod @3 21600 pixelHeight"/>
+              <v:f eqn="sum @0 0 1"/>
+              <v:f eqn="prod @6 1 2"/>
+              <v:f eqn="prod @7 21600 pixelWidth"/>
+              <v:f eqn="sum @8 21600 0"/>
+              <v:f eqn="prod @7 21600 pixelHeight"/>
+              <v:f eqn="sum @10 21600 0"/>
+            </v:formulas>
+            <v:path o:extrusionok="f" gradientshapeok="t" o:connecttype="rect"/>
+            <o:lock v:ext="edit" aspectratio="t"/>
+          </v:shapetype>
+          <v:shape id="_x0000_i1026" type="#_x0000_t75" alt="Mostrando Diagrama de clases.drawio.png" style="width:24.2pt;height:24.2pt"/>
+        </w:pict>
+      </w:r>
+      <w:r>
+        <w:fldChar w:fldCharType="end"/>
+      </w:r>
+    </w:p>
     <w:p>
       <w:pPr>
         <w:pStyle w:val="Ttulo3"/>
       </w:pPr>
       <w:bookmarkStart w:id="8" w:name="_Toc241504837"/>
       <w:r>
+        <w:lastRenderedPageBreak/>
         <w:t>Diagrama de Secuencia</w:t>
       </w:r>
       <w:bookmarkEnd w:id="8"/>
@@ -2612,6 +2727,47 @@
           <w:lang w:val="es-ES" w:eastAsia="es-ES"/>
         </w:rPr>
       </w:pPr>
+      <w:r>
+        <w:rPr>
+          <w:noProof/>
+          <w:lang w:val="es-ES" w:eastAsia="es-ES"/>
+        </w:rPr>
+        <w:drawing>
+          <wp:inline distT="0" distB="0" distL="0" distR="0" wp14:anchorId="65C9B032" wp14:editId="654E3EC8">
+            <wp:extent cx="5612130" cy="5119370"/>
+            <wp:effectExtent l="0" t="0" r="0" b="0"/>
+            <wp:docPr id="1932307129" name="Imagen 5"/>
+            <wp:cNvGraphicFramePr>
+              <a:graphicFrameLocks xmlns:a="http://schemas.openxmlformats.org/drawingml/2006/main" noChangeAspect="1"/>
+            </wp:cNvGraphicFramePr>
+            <a:graphic xmlns:a="http://schemas.openxmlformats.org/drawingml/2006/main">
+              <a:graphicData uri="http://schemas.openxmlformats.org/drawingml/2006/picture">
+                <pic:pic xmlns:pic="http://schemas.openxmlformats.org/drawingml/2006/picture">
+                  <pic:nvPicPr>
+                    <pic:cNvPr id="1932307129" name="Imagen 1932307129"/>
+                    <pic:cNvPicPr/>
+                  </pic:nvPicPr>
+                  <pic:blipFill>
+                    <a:blip r:embed="rId15"/>
+                    <a:stretch>
+                      <a:fillRect/>
+                    </a:stretch>
+                  </pic:blipFill>
+                  <pic:spPr>
+                    <a:xfrm>
+                      <a:off x="0" y="0"/>
+                      <a:ext cx="5612130" cy="5119370"/>
+                    </a:xfrm>
+                    <a:prstGeom prst="rect">
+                      <a:avLst/>
+                    </a:prstGeom>
+                  </pic:spPr>
+                </pic:pic>
+              </a:graphicData>
+            </a:graphic>
+          </wp:inline>
+        </w:drawing>
+      </w:r>
     </w:p>
     <w:p>
       <w:pPr>
@@ -2619,6 +2775,7 @@
       </w:pPr>
       <w:bookmarkStart w:id="9" w:name="_Toc241504838"/>
       <w:r>
+        <w:lastRenderedPageBreak/>
         <w:t>Vista Despliegue</w:t>
       </w:r>
       <w:bookmarkEnd w:id="9"/>
@@ -2633,11 +2790,52 @@
       </w:r>
       <w:bookmarkEnd w:id="10"/>
     </w:p>
-    <w:p/>
+    <w:p>
+      <w:r>
+        <w:rPr>
+          <w:noProof/>
+        </w:rPr>
+        <w:drawing>
+          <wp:inline distT="0" distB="0" distL="0" distR="0" wp14:anchorId="3F3712D2" wp14:editId="3130539B">
+            <wp:extent cx="5612130" cy="4702810"/>
+            <wp:effectExtent l="0" t="0" r="0" b="0"/>
+            <wp:docPr id="1913179418" name="Imagen 8"/>
+            <wp:cNvGraphicFramePr>
+              <a:graphicFrameLocks xmlns:a="http://schemas.openxmlformats.org/drawingml/2006/main" noChangeAspect="1"/>
+            </wp:cNvGraphicFramePr>
+            <a:graphic xmlns:a="http://schemas.openxmlformats.org/drawingml/2006/main">
+              <a:graphicData uri="http://schemas.openxmlformats.org/drawingml/2006/picture">
+                <pic:pic xmlns:pic="http://schemas.openxmlformats.org/drawingml/2006/picture">
+                  <pic:nvPicPr>
+                    <pic:cNvPr id="1913179418" name="Imagen 1913179418"/>
+                    <pic:cNvPicPr/>
+                  </pic:nvPicPr>
+                  <pic:blipFill>
+                    <a:blip r:embed="rId16"/>
+                    <a:stretch>
+                      <a:fillRect/>
+                    </a:stretch>
+                  </pic:blipFill>
+                  <pic:spPr>
+                    <a:xfrm>
+                      <a:off x="0" y="0"/>
+                      <a:ext cx="5612130" cy="4702810"/>
+                    </a:xfrm>
+                    <a:prstGeom prst="rect">
+                      <a:avLst/>
+                    </a:prstGeom>
+                  </pic:spPr>
+                </pic:pic>
+              </a:graphicData>
+            </a:graphic>
+          </wp:inline>
+        </w:drawing>
+      </w:r>
+    </w:p>
     <w:sectPr>
-      <w:headerReference w:type="default" r:id="rId12"/>
-      <w:footerReference w:type="default" r:id="rId13"/>
-      <w:headerReference w:type="first" r:id="rId14"/>
+      <w:headerReference w:type="default" r:id="rId17"/>
+      <w:footerReference w:type="default" r:id="rId18"/>
+      <w:headerReference w:type="first" r:id="rId19"/>
       <w:pgSz w:w="12240" w:h="15840"/>
       <w:pgMar w:top="1417" w:right="1701" w:bottom="1417" w:left="1701" w:header="708" w:footer="708" w:gutter="0"/>
       <w:cols w:space="708"/>
@@ -2649,7 +2847,7 @@
 </file>
 
 <file path=word/endnotes.xml><?xml version="1.0" encoding="utf-8"?>
-<w:endnotes xmlns:wpc="http://schemas.microsoft.com/office/word/2010/wordprocessingCanvas" xmlns:cx="http://schemas.microsoft.com/office/drawing/2014/chartex" xmlns:cx1="http://schemas.microsoft.com/office/drawing/2015/9/8/chartex" xmlns:cx2="http://schemas.microsoft.com/office/drawing/2015/10/21/chartex" xmlns:cx3="http://schemas.microsoft.com/office/drawing/2016/5/9/chartex" xmlns:cx4="http://schemas.microsoft.com/office/drawing/2016/5/10/chartex" xmlns:cx5="http://schemas.microsoft.com/office/drawing/2016/5/11/chartex" xmlns:cx6="http://schemas.microsoft.com/office/drawing/2016/5/12/chartex" xmlns:cx7="http://schemas.microsoft.com/office/drawing/2016/5/13/chartex" xmlns:cx8="http://schemas.microsoft.com/office/drawing/2016/5/14/chartex" xmlns:mc="http://schemas.openxmlformats.org/markup-compatibility/2006" xmlns:m="http://schemas.openxmlformats.org/officeDocument/2006/math" xmlns:aink="http://schemas.microsoft.com/office/drawing/2016/ink" xmlns:am3d="http://schemas.microsoft.com/office/drawing/2017/model3d" xmlns:oel="http://schemas.microsoft.com/office/2019/extlst" xmlns:r="http://schemas.openxmlformats.org/officeDocument/2006/relationships" xmlns:wp14="http://schemas.microsoft.com/office/word/2010/wordprocessingDrawing" xmlns:wp="http://schemas.openxmlformats.org/drawingml/2006/wordprocessingDrawing" xmlns:wpg="http://schemas.microsoft.com/office/word/2010/wordprocessingGroup" xmlns:wpi="http://schemas.microsoft.com/office/word/2010/wordprocessingInk" xmlns:wps="http://schemas.microsoft.com/office/word/2010/wordprocessingShape" xmlns:o="urn:schemas-microsoft-com:office:office" xmlns:v="urn:schemas-microsoft-com:vml" xmlns:w10="urn:schemas-microsoft-com:office:word" xmlns:w="http://schemas.openxmlformats.org/wordprocessingml/2006/main" xmlns:w14="http://schemas.microsoft.com/office/word/2010/wordml" xmlns:w15="http://schemas.microsoft.com/office/word/2012/wordml" xmlns:w16cex="http://schemas.microsoft.com/office/word/2018/wordml/cex" xmlns:w16cid="http://schemas.microsoft.com/office/word/2016/wordml/cid" xmlns:w16="http://schemas.microsoft.com/office/word/2018/wordml" xmlns:w16sdtdh="http://schemas.microsoft.com/office/word/2020/wordml/sdtdatahash" xmlns:w16sdtfl="http://schemas.microsoft.com/office/word/2024/wordml/sdtformatlock" xmlns:w16se="http://schemas.microsoft.com/office/word/2015/wordml/symex" xmlns:w16du="http://schemas.microsoft.com/office/word/2023/wordml/word16du" xmlns:wne="http://schemas.microsoft.com/office/word/2006/wordml" mc:Ignorable="w14 w15 w16se w16cid w16 w16cex w16sdtdh w16sdtfl w16du wp14">
+<w:endnotes xmlns:wpc="http://schemas.microsoft.com/office/word/2010/wordprocessingCanvas" xmlns:cx="http://schemas.microsoft.com/office/drawing/2014/chartex" xmlns:cx1="http://schemas.microsoft.com/office/drawing/2015/9/8/chartex" xmlns:cx2="http://schemas.microsoft.com/office/drawing/2015/10/21/chartex" xmlns:cx3="http://schemas.microsoft.com/office/drawing/2016/5/9/chartex" xmlns:cx4="http://schemas.microsoft.com/office/drawing/2016/5/10/chartex" xmlns:cx5="http://schemas.microsoft.com/office/drawing/2016/5/11/chartex" xmlns:cx6="http://schemas.microsoft.com/office/drawing/2016/5/12/chartex" xmlns:cx7="http://schemas.microsoft.com/office/drawing/2016/5/13/chartex" xmlns:cx8="http://schemas.microsoft.com/office/drawing/2016/5/14/chartex" xmlns:mc="http://schemas.openxmlformats.org/markup-compatibility/2006" xmlns:aink="http://schemas.microsoft.com/office/drawing/2016/ink" xmlns:am3d="http://schemas.microsoft.com/office/drawing/2017/model3d" xmlns:o="urn:schemas-microsoft-com:office:office" xmlns:oel="http://schemas.microsoft.com/office/2019/extlst" xmlns:r="http://schemas.openxmlformats.org/officeDocument/2006/relationships" xmlns:m="http://schemas.openxmlformats.org/officeDocument/2006/math" xmlns:v="urn:schemas-microsoft-com:vml" xmlns:wp14="http://schemas.microsoft.com/office/word/2010/wordprocessingDrawing" xmlns:wp="http://schemas.openxmlformats.org/drawingml/2006/wordprocessingDrawing" xmlns:w10="urn:schemas-microsoft-com:office:word" xmlns:w="http://schemas.openxmlformats.org/wordprocessingml/2006/main" xmlns:w14="http://schemas.microsoft.com/office/word/2010/wordml" xmlns:w15="http://schemas.microsoft.com/office/word/2012/wordml" xmlns:w16cex="http://schemas.microsoft.com/office/word/2018/wordml/cex" xmlns:w16cid="http://schemas.microsoft.com/office/word/2016/wordml/cid" xmlns:w16="http://schemas.microsoft.com/office/word/2018/wordml" xmlns:w16du="http://schemas.microsoft.com/office/word/2023/wordml/word16du" xmlns:w16sdtdh="http://schemas.microsoft.com/office/word/2020/wordml/sdtdatahash" xmlns:w16sdtfl="http://schemas.microsoft.com/office/word/2024/wordml/sdtformatlock" xmlns:w16se="http://schemas.microsoft.com/office/word/2015/wordml/symex" xmlns:wpg="http://schemas.microsoft.com/office/word/2010/wordprocessingGroup" xmlns:wpi="http://schemas.microsoft.com/office/word/2010/wordprocessingInk" xmlns:wne="http://schemas.microsoft.com/office/word/2006/wordml" xmlns:wps="http://schemas.microsoft.com/office/word/2010/wordprocessingShape" mc:Ignorable="w14 w15 w16se w16cid w16 w16cex w16sdtdh w16sdtfl w16du wp14">
   <w:endnote w:type="separator" w:id="-1">
     <w:p>
       <w:pPr>
@@ -2674,7 +2872,7 @@
 </file>
 
 <file path=word/footer1.xml><?xml version="1.0" encoding="utf-8"?>
-<w:ftr xmlns:wpc="http://schemas.microsoft.com/office/word/2010/wordprocessingCanvas" xmlns:cx="http://schemas.microsoft.com/office/drawing/2014/chartex" xmlns:cx1="http://schemas.microsoft.com/office/drawing/2015/9/8/chartex" xmlns:cx2="http://schemas.microsoft.com/office/drawing/2015/10/21/chartex" xmlns:cx3="http://schemas.microsoft.com/office/drawing/2016/5/9/chartex" xmlns:cx4="http://schemas.microsoft.com/office/drawing/2016/5/10/chartex" xmlns:cx5="http://schemas.microsoft.com/office/drawing/2016/5/11/chartex" xmlns:cx6="http://schemas.microsoft.com/office/drawing/2016/5/12/chartex" xmlns:cx7="http://schemas.microsoft.com/office/drawing/2016/5/13/chartex" xmlns:cx8="http://schemas.microsoft.com/office/drawing/2016/5/14/chartex" xmlns:mc="http://schemas.openxmlformats.org/markup-compatibility/2006" xmlns:m="http://schemas.openxmlformats.org/officeDocument/2006/math" xmlns:aink="http://schemas.microsoft.com/office/drawing/2016/ink" xmlns:am3d="http://schemas.microsoft.com/office/drawing/2017/model3d" xmlns:oel="http://schemas.microsoft.com/office/2019/extlst" xmlns:r="http://schemas.openxmlformats.org/officeDocument/2006/relationships" xmlns:wp14="http://schemas.microsoft.com/office/word/2010/wordprocessingDrawing" xmlns:wp="http://schemas.openxmlformats.org/drawingml/2006/wordprocessingDrawing" xmlns:wpg="http://schemas.microsoft.com/office/word/2010/wordprocessingGroup" xmlns:wpi="http://schemas.microsoft.com/office/word/2010/wordprocessingInk" xmlns:wps="http://schemas.microsoft.com/office/word/2010/wordprocessingShape" xmlns:o="urn:schemas-microsoft-com:office:office" xmlns:v="urn:schemas-microsoft-com:vml" xmlns:w10="urn:schemas-microsoft-com:office:word" xmlns:w="http://schemas.openxmlformats.org/wordprocessingml/2006/main" xmlns:w14="http://schemas.microsoft.com/office/word/2010/wordml" xmlns:w15="http://schemas.microsoft.com/office/word/2012/wordml" xmlns:w16cex="http://schemas.microsoft.com/office/word/2018/wordml/cex" xmlns:w16cid="http://schemas.microsoft.com/office/word/2016/wordml/cid" xmlns:w16="http://schemas.microsoft.com/office/word/2018/wordml" xmlns:w16sdtdh="http://schemas.microsoft.com/office/word/2020/wordml/sdtdatahash" xmlns:w16sdtfl="http://schemas.microsoft.com/office/word/2024/wordml/sdtformatlock" xmlns:w16se="http://schemas.microsoft.com/office/word/2015/wordml/symex" xmlns:w16du="http://schemas.microsoft.com/office/word/2023/wordml/word16du" xmlns:wne="http://schemas.microsoft.com/office/word/2006/wordml" mc:Ignorable="w14 w15 w16se w16cid w16 w16cex w16sdtdh w16sdtfl w16du wp14">
+<w:ftr xmlns:wpc="http://schemas.microsoft.com/office/word/2010/wordprocessingCanvas" xmlns:cx="http://schemas.microsoft.com/office/drawing/2014/chartex" xmlns:cx1="http://schemas.microsoft.com/office/drawing/2015/9/8/chartex" xmlns:cx2="http://schemas.microsoft.com/office/drawing/2015/10/21/chartex" xmlns:cx3="http://schemas.microsoft.com/office/drawing/2016/5/9/chartex" xmlns:cx4="http://schemas.microsoft.com/office/drawing/2016/5/10/chartex" xmlns:cx5="http://schemas.microsoft.com/office/drawing/2016/5/11/chartex" xmlns:cx6="http://schemas.microsoft.com/office/drawing/2016/5/12/chartex" xmlns:cx7="http://schemas.microsoft.com/office/drawing/2016/5/13/chartex" xmlns:cx8="http://schemas.microsoft.com/office/drawing/2016/5/14/chartex" xmlns:mc="http://schemas.openxmlformats.org/markup-compatibility/2006" xmlns:aink="http://schemas.microsoft.com/office/drawing/2016/ink" xmlns:am3d="http://schemas.microsoft.com/office/drawing/2017/model3d" xmlns:o="urn:schemas-microsoft-com:office:office" xmlns:oel="http://schemas.microsoft.com/office/2019/extlst" xmlns:r="http://schemas.openxmlformats.org/officeDocument/2006/relationships" xmlns:m="http://schemas.openxmlformats.org/officeDocument/2006/math" xmlns:v="urn:schemas-microsoft-com:vml" xmlns:wp14="http://schemas.microsoft.com/office/word/2010/wordprocessingDrawing" xmlns:wp="http://schemas.openxmlformats.org/drawingml/2006/wordprocessingDrawing" xmlns:w10="urn:schemas-microsoft-com:office:word" xmlns:w="http://schemas.openxmlformats.org/wordprocessingml/2006/main" xmlns:w14="http://schemas.microsoft.com/office/word/2010/wordml" xmlns:w15="http://schemas.microsoft.com/office/word/2012/wordml" xmlns:w16cex="http://schemas.microsoft.com/office/word/2018/wordml/cex" xmlns:w16cid="http://schemas.microsoft.com/office/word/2016/wordml/cid" xmlns:w16="http://schemas.microsoft.com/office/word/2018/wordml" xmlns:w16du="http://schemas.microsoft.com/office/word/2023/wordml/word16du" xmlns:w16sdtdh="http://schemas.microsoft.com/office/word/2020/wordml/sdtdatahash" xmlns:w16sdtfl="http://schemas.microsoft.com/office/word/2024/wordml/sdtformatlock" xmlns:w16se="http://schemas.microsoft.com/office/word/2015/wordml/symex" xmlns:wpg="http://schemas.microsoft.com/office/word/2010/wordprocessingGroup" xmlns:wpi="http://schemas.microsoft.com/office/word/2010/wordprocessingInk" xmlns:wne="http://schemas.microsoft.com/office/word/2006/wordml" xmlns:wps="http://schemas.microsoft.com/office/word/2010/wordprocessingShape" mc:Ignorable="w14 w15 w16se w16cid w16 w16cex w16sdtdh w16sdtfl w16du wp14">
   <w:sdt>
     <w:sdtPr>
       <w:id w:val="14532529"/>
@@ -2702,13 +2900,7 @@
           <w:rPr>
             <w:noProof/>
           </w:rPr>
-          <w:t>1</w:t>
-        </w:r>
-        <w:r>
-          <w:rPr>
-            <w:noProof/>
-          </w:rPr>
-          <w:t>3</w:t>
+          <w:t>13</w:t>
         </w:r>
         <w:r>
           <w:rPr>
@@ -2728,7 +2920,7 @@
 </file>
 
 <file path=word/footnotes.xml><?xml version="1.0" encoding="utf-8"?>
-<w:footnotes xmlns:wpc="http://schemas.microsoft.com/office/word/2010/wordprocessingCanvas" xmlns:cx="http://schemas.microsoft.com/office/drawing/2014/chartex" xmlns:cx1="http://schemas.microsoft.com/office/drawing/2015/9/8/chartex" xmlns:cx2="http://schemas.microsoft.com/office/drawing/2015/10/21/chartex" xmlns:cx3="http://schemas.microsoft.com/office/drawing/2016/5/9/chartex" xmlns:cx4="http://schemas.microsoft.com/office/drawing/2016/5/10/chartex" xmlns:cx5="http://schemas.microsoft.com/office/drawing/2016/5/11/chartex" xmlns:cx6="http://schemas.microsoft.com/office/drawing/2016/5/12/chartex" xmlns:cx7="http://schemas.microsoft.com/office/drawing/2016/5/13/chartex" xmlns:cx8="http://schemas.microsoft.com/office/drawing/2016/5/14/chartex" xmlns:mc="http://schemas.openxmlformats.org/markup-compatibility/2006" xmlns:m="http://schemas.openxmlformats.org/officeDocument/2006/math" xmlns:aink="http://schemas.microsoft.com/office/drawing/2016/ink" xmlns:am3d="http://schemas.microsoft.com/office/drawing/2017/model3d" xmlns:oel="http://schemas.microsoft.com/office/2019/extlst" xmlns:r="http://schemas.openxmlformats.org/officeDocument/2006/relationships" xmlns:wp14="http://schemas.microsoft.com/office/word/2010/wordprocessingDrawing" xmlns:wp="http://schemas.openxmlformats.org/drawingml/2006/wordprocessingDrawing" xmlns:wpg="http://schemas.microsoft.com/office/word/2010/wordprocessingGroup" xmlns:wpi="http://schemas.microsoft.com/office/word/2010/wordprocessingInk" xmlns:wps="http://schemas.microsoft.com/office/word/2010/wordprocessingShape" xmlns:o="urn:schemas-microsoft-com:office:office" xmlns:v="urn:schemas-microsoft-com:vml" xmlns:w10="urn:schemas-microsoft-com:office:word" xmlns:w="http://schemas.openxmlformats.org/wordprocessingml/2006/main" xmlns:w14="http://schemas.microsoft.com/office/word/2010/wordml" xmlns:w15="http://schemas.microsoft.com/office/word/2012/wordml" xmlns:w16cex="http://schemas.microsoft.com/office/word/2018/wordml/cex" xmlns:w16cid="http://schemas.microsoft.com/office/word/2016/wordml/cid" xmlns:w16="http://schemas.microsoft.com/office/word/2018/wordml" xmlns:w16sdtdh="http://schemas.microsoft.com/office/word/2020/wordml/sdtdatahash" xmlns:w16sdtfl="http://schemas.microsoft.com/office/word/2024/wordml/sdtformatlock" xmlns:w16se="http://schemas.microsoft.com/office/word/2015/wordml/symex" xmlns:w16du="http://schemas.microsoft.com/office/word/2023/wordml/word16du" xmlns:wne="http://schemas.microsoft.com/office/word/2006/wordml" mc:Ignorable="w14 w15 w16se w16cid w16 w16cex w16sdtdh w16sdtfl w16du wp14">
+<w:footnotes xmlns:wpc="http://schemas.microsoft.com/office/word/2010/wordprocessingCanvas" xmlns:cx="http://schemas.microsoft.com/office/drawing/2014/chartex" xmlns:cx1="http://schemas.microsoft.com/office/drawing/2015/9/8/chartex" xmlns:cx2="http://schemas.microsoft.com/office/drawing/2015/10/21/chartex" xmlns:cx3="http://schemas.microsoft.com/office/drawing/2016/5/9/chartex" xmlns:cx4="http://schemas.microsoft.com/office/drawing/2016/5/10/chartex" xmlns:cx5="http://schemas.microsoft.com/office/drawing/2016/5/11/chartex" xmlns:cx6="http://schemas.microsoft.com/office/drawing/2016/5/12/chartex" xmlns:cx7="http://schemas.microsoft.com/office/drawing/2016/5/13/chartex" xmlns:cx8="http://schemas.microsoft.com/office/drawing/2016/5/14/chartex" xmlns:mc="http://schemas.openxmlformats.org/markup-compatibility/2006" xmlns:aink="http://schemas.microsoft.com/office/drawing/2016/ink" xmlns:am3d="http://schemas.microsoft.com/office/drawing/2017/model3d" xmlns:o="urn:schemas-microsoft-com:office:office" xmlns:oel="http://schemas.microsoft.com/office/2019/extlst" xmlns:r="http://schemas.openxmlformats.org/officeDocument/2006/relationships" xmlns:m="http://schemas.openxmlformats.org/officeDocument/2006/math" xmlns:v="urn:schemas-microsoft-com:vml" xmlns:wp14="http://schemas.microsoft.com/office/word/2010/wordprocessingDrawing" xmlns:wp="http://schemas.openxmlformats.org/drawingml/2006/wordprocessingDrawing" xmlns:w10="urn:schemas-microsoft-com:office:word" xmlns:w="http://schemas.openxmlformats.org/wordprocessingml/2006/main" xmlns:w14="http://schemas.microsoft.com/office/word/2010/wordml" xmlns:w15="http://schemas.microsoft.com/office/word/2012/wordml" xmlns:w16cex="http://schemas.microsoft.com/office/word/2018/wordml/cex" xmlns:w16cid="http://schemas.microsoft.com/office/word/2016/wordml/cid" xmlns:w16="http://schemas.microsoft.com/office/word/2018/wordml" xmlns:w16du="http://schemas.microsoft.com/office/word/2023/wordml/word16du" xmlns:w16sdtdh="http://schemas.microsoft.com/office/word/2020/wordml/sdtdatahash" xmlns:w16sdtfl="http://schemas.microsoft.com/office/word/2024/wordml/sdtformatlock" xmlns:w16se="http://schemas.microsoft.com/office/word/2015/wordml/symex" xmlns:wpg="http://schemas.microsoft.com/office/word/2010/wordprocessingGroup" xmlns:wpi="http://schemas.microsoft.com/office/word/2010/wordprocessingInk" xmlns:wne="http://schemas.microsoft.com/office/word/2006/wordml" xmlns:wps="http://schemas.microsoft.com/office/word/2010/wordprocessingShape" mc:Ignorable="w14 w15 w16se w16cid w16 w16cex w16sdtdh w16sdtfl w16du wp14">
   <w:footnote w:type="separator" w:id="-1">
     <w:p>
       <w:pPr>
@@ -2753,7 +2945,7 @@
 </file>
 
 <file path=word/header1.xml><?xml version="1.0" encoding="utf-8"?>
-<w:hdr xmlns:wpc="http://schemas.microsoft.com/office/word/2010/wordprocessingCanvas" xmlns:cx="http://schemas.microsoft.com/office/drawing/2014/chartex" xmlns:cx1="http://schemas.microsoft.com/office/drawing/2015/9/8/chartex" xmlns:cx2="http://schemas.microsoft.com/office/drawing/2015/10/21/chartex" xmlns:cx3="http://schemas.microsoft.com/office/drawing/2016/5/9/chartex" xmlns:cx4="http://schemas.microsoft.com/office/drawing/2016/5/10/chartex" xmlns:cx5="http://schemas.microsoft.com/office/drawing/2016/5/11/chartex" xmlns:cx6="http://schemas.microsoft.com/office/drawing/2016/5/12/chartex" xmlns:cx7="http://schemas.microsoft.com/office/drawing/2016/5/13/chartex" xmlns:cx8="http://schemas.microsoft.com/office/drawing/2016/5/14/chartex" xmlns:mc="http://schemas.openxmlformats.org/markup-compatibility/2006" xmlns:m="http://schemas.openxmlformats.org/officeDocument/2006/math" xmlns:aink="http://schemas.microsoft.com/office/drawing/2016/ink" xmlns:am3d="http://schemas.microsoft.com/office/drawing/2017/model3d" xmlns:oel="http://schemas.microsoft.com/office/2019/extlst" xmlns:r="http://schemas.openxmlformats.org/officeDocument/2006/relationships" xmlns:wp14="http://schemas.microsoft.com/office/word/2010/wordprocessingDrawing" xmlns:wp="http://schemas.openxmlformats.org/drawingml/2006/wordprocessingDrawing" xmlns:wpg="http://schemas.microsoft.com/office/word/2010/wordprocessingGroup" xmlns:wpi="http://schemas.microsoft.com/office/word/2010/wordprocessingInk" xmlns:wps="http://schemas.microsoft.com/office/word/2010/wordprocessingShape" xmlns:o="urn:schemas-microsoft-com:office:office" xmlns:v="urn:schemas-microsoft-com:vml" xmlns:w10="urn:schemas-microsoft-com:office:word" xmlns:w="http://schemas.openxmlformats.org/wordprocessingml/2006/main" xmlns:w14="http://schemas.microsoft.com/office/word/2010/wordml" xmlns:w15="http://schemas.microsoft.com/office/word/2012/wordml" xmlns:w16cex="http://schemas.microsoft.com/office/word/2018/wordml/cex" xmlns:w16cid="http://schemas.microsoft.com/office/word/2016/wordml/cid" xmlns:w16="http://schemas.microsoft.com/office/word/2018/wordml" xmlns:w16sdtdh="http://schemas.microsoft.com/office/word/2020/wordml/sdtdatahash" xmlns:w16sdtfl="http://schemas.microsoft.com/office/word/2024/wordml/sdtformatlock" xmlns:w16se="http://schemas.microsoft.com/office/word/2015/wordml/symex" xmlns:w16du="http://schemas.microsoft.com/office/word/2023/wordml/word16du" xmlns:wne="http://schemas.microsoft.com/office/word/2006/wordml" mc:Ignorable="w14 w15 w16se w16cid w16 w16cex w16sdtdh w16sdtfl w16du wp14">
+<w:hdr xmlns:wpc="http://schemas.microsoft.com/office/word/2010/wordprocessingCanvas" xmlns:cx="http://schemas.microsoft.com/office/drawing/2014/chartex" xmlns:cx1="http://schemas.microsoft.com/office/drawing/2015/9/8/chartex" xmlns:cx2="http://schemas.microsoft.com/office/drawing/2015/10/21/chartex" xmlns:cx3="http://schemas.microsoft.com/office/drawing/2016/5/9/chartex" xmlns:cx4="http://schemas.microsoft.com/office/drawing/2016/5/10/chartex" xmlns:cx5="http://schemas.microsoft.com/office/drawing/2016/5/11/chartex" xmlns:cx6="http://schemas.microsoft.com/office/drawing/2016/5/12/chartex" xmlns:cx7="http://schemas.microsoft.com/office/drawing/2016/5/13/chartex" xmlns:cx8="http://schemas.microsoft.com/office/drawing/2016/5/14/chartex" xmlns:mc="http://schemas.openxmlformats.org/markup-compatibility/2006" xmlns:aink="http://schemas.microsoft.com/office/drawing/2016/ink" xmlns:am3d="http://schemas.microsoft.com/office/drawing/2017/model3d" xmlns:o="urn:schemas-microsoft-com:office:office" xmlns:oel="http://schemas.microsoft.com/office/2019/extlst" xmlns:r="http://schemas.openxmlformats.org/officeDocument/2006/relationships" xmlns:m="http://schemas.openxmlformats.org/officeDocument/2006/math" xmlns:v="urn:schemas-microsoft-com:vml" xmlns:wp14="http://schemas.microsoft.com/office/word/2010/wordprocessingDrawing" xmlns:wp="http://schemas.openxmlformats.org/drawingml/2006/wordprocessingDrawing" xmlns:w10="urn:schemas-microsoft-com:office:word" xmlns:w="http://schemas.openxmlformats.org/wordprocessingml/2006/main" xmlns:w14="http://schemas.microsoft.com/office/word/2010/wordml" xmlns:w15="http://schemas.microsoft.com/office/word/2012/wordml" xmlns:w16cex="http://schemas.microsoft.com/office/word/2018/wordml/cex" xmlns:w16cid="http://schemas.microsoft.com/office/word/2016/wordml/cid" xmlns:w16="http://schemas.microsoft.com/office/word/2018/wordml" xmlns:w16du="http://schemas.microsoft.com/office/word/2023/wordml/word16du" xmlns:w16sdtdh="http://schemas.microsoft.com/office/word/2020/wordml/sdtdatahash" xmlns:w16sdtfl="http://schemas.microsoft.com/office/word/2024/wordml/sdtformatlock" xmlns:w16se="http://schemas.microsoft.com/office/word/2015/wordml/symex" xmlns:wpg="http://schemas.microsoft.com/office/word/2010/wordprocessingGroup" xmlns:wpi="http://schemas.microsoft.com/office/word/2010/wordprocessingInk" xmlns:wne="http://schemas.microsoft.com/office/word/2006/wordml" xmlns:wps="http://schemas.microsoft.com/office/word/2010/wordprocessingShape" mc:Ignorable="w14 w15 w16se w16cid w16 w16cex w16sdtdh w16sdtfl w16du wp14">
   <w:p>
     <w:pPr>
       <w:pStyle w:val="Encabezado"/>
@@ -2858,7 +3050,7 @@
 </file>
 
 <file path=word/header2.xml><?xml version="1.0" encoding="utf-8"?>
-<w:hdr xmlns:wpc="http://schemas.microsoft.com/office/word/2010/wordprocessingCanvas" xmlns:cx="http://schemas.microsoft.com/office/drawing/2014/chartex" xmlns:cx1="http://schemas.microsoft.com/office/drawing/2015/9/8/chartex" xmlns:cx2="http://schemas.microsoft.com/office/drawing/2015/10/21/chartex" xmlns:cx3="http://schemas.microsoft.com/office/drawing/2016/5/9/chartex" xmlns:cx4="http://schemas.microsoft.com/office/drawing/2016/5/10/chartex" xmlns:cx5="http://schemas.microsoft.com/office/drawing/2016/5/11/chartex" xmlns:cx6="http://schemas.microsoft.com/office/drawing/2016/5/12/chartex" xmlns:cx7="http://schemas.microsoft.com/office/drawing/2016/5/13/chartex" xmlns:cx8="http://schemas.microsoft.com/office/drawing/2016/5/14/chartex" xmlns:mc="http://schemas.openxmlformats.org/markup-compatibility/2006" xmlns:m="http://schemas.openxmlformats.org/officeDocument/2006/math" xmlns:aink="http://schemas.microsoft.com/office/drawing/2016/ink" xmlns:am3d="http://schemas.microsoft.com/office/drawing/2017/model3d" xmlns:oel="http://schemas.microsoft.com/office/2019/extlst" xmlns:r="http://schemas.openxmlformats.org/officeDocument/2006/relationships" xmlns:wp14="http://schemas.microsoft.com/office/word/2010/wordprocessingDrawing" xmlns:wp="http://schemas.openxmlformats.org/drawingml/2006/wordprocessingDrawing" xmlns:wpg="http://schemas.microsoft.com/office/word/2010/wordprocessingGroup" xmlns:wpi="http://schemas.microsoft.com/office/word/2010/wordprocessingInk" xmlns:wps="http://schemas.microsoft.com/office/word/2010/wordprocessingShape" xmlns:o="urn:schemas-microsoft-com:office:office" xmlns:v="urn:schemas-microsoft-com:vml" xmlns:w10="urn:schemas-microsoft-com:office:word" xmlns:w="http://schemas.openxmlformats.org/wordprocessingml/2006/main" xmlns:w14="http://schemas.microsoft.com/office/word/2010/wordml" xmlns:w15="http://schemas.microsoft.com/office/word/2012/wordml" xmlns:w16cex="http://schemas.microsoft.com/office/word/2018/wordml/cex" xmlns:w16cid="http://schemas.microsoft.com/office/word/2016/wordml/cid" xmlns:w16="http://schemas.microsoft.com/office/word/2018/wordml" xmlns:w16sdtdh="http://schemas.microsoft.com/office/word/2020/wordml/sdtdatahash" xmlns:w16sdtfl="http://schemas.microsoft.com/office/word/2024/wordml/sdtformatlock" xmlns:w16se="http://schemas.microsoft.com/office/word/2015/wordml/symex" xmlns:w16du="http://schemas.microsoft.com/office/word/2023/wordml/word16du" xmlns:wne="http://schemas.microsoft.com/office/word/2006/wordml" mc:Ignorable="w14 w15 w16se w16cid w16 w16cex w16sdtdh w16sdtfl w16du wp14">
+<w:hdr xmlns:wpc="http://schemas.microsoft.com/office/word/2010/wordprocessingCanvas" xmlns:cx="http://schemas.microsoft.com/office/drawing/2014/chartex" xmlns:cx1="http://schemas.microsoft.com/office/drawing/2015/9/8/chartex" xmlns:cx2="http://schemas.microsoft.com/office/drawing/2015/10/21/chartex" xmlns:cx3="http://schemas.microsoft.com/office/drawing/2016/5/9/chartex" xmlns:cx4="http://schemas.microsoft.com/office/drawing/2016/5/10/chartex" xmlns:cx5="http://schemas.microsoft.com/office/drawing/2016/5/11/chartex" xmlns:cx6="http://schemas.microsoft.com/office/drawing/2016/5/12/chartex" xmlns:cx7="http://schemas.microsoft.com/office/drawing/2016/5/13/chartex" xmlns:cx8="http://schemas.microsoft.com/office/drawing/2016/5/14/chartex" xmlns:mc="http://schemas.openxmlformats.org/markup-compatibility/2006" xmlns:aink="http://schemas.microsoft.com/office/drawing/2016/ink" xmlns:am3d="http://schemas.microsoft.com/office/drawing/2017/model3d" xmlns:o="urn:schemas-microsoft-com:office:office" xmlns:oel="http://schemas.microsoft.com/office/2019/extlst" xmlns:r="http://schemas.openxmlformats.org/officeDocument/2006/relationships" xmlns:m="http://schemas.openxmlformats.org/officeDocument/2006/math" xmlns:v="urn:schemas-microsoft-com:vml" xmlns:wp14="http://schemas.microsoft.com/office/word/2010/wordprocessingDrawing" xmlns:wp="http://schemas.openxmlformats.org/drawingml/2006/wordprocessingDrawing" xmlns:w10="urn:schemas-microsoft-com:office:word" xmlns:w="http://schemas.openxmlformats.org/wordprocessingml/2006/main" xmlns:w14="http://schemas.microsoft.com/office/word/2010/wordml" xmlns:w15="http://schemas.microsoft.com/office/word/2012/wordml" xmlns:w16cex="http://schemas.microsoft.com/office/word/2018/wordml/cex" xmlns:w16cid="http://schemas.microsoft.com/office/word/2016/wordml/cid" xmlns:w16="http://schemas.microsoft.com/office/word/2018/wordml" xmlns:w16du="http://schemas.microsoft.com/office/word/2023/wordml/word16du" xmlns:w16sdtdh="http://schemas.microsoft.com/office/word/2020/wordml/sdtdatahash" xmlns:w16sdtfl="http://schemas.microsoft.com/office/word/2024/wordml/sdtformatlock" xmlns:w16se="http://schemas.microsoft.com/office/word/2015/wordml/symex" xmlns:wpg="http://schemas.microsoft.com/office/word/2010/wordprocessingGroup" xmlns:wpi="http://schemas.microsoft.com/office/word/2010/wordprocessingInk" xmlns:wne="http://schemas.microsoft.com/office/word/2006/wordml" xmlns:wps="http://schemas.microsoft.com/office/word/2010/wordprocessingShape" mc:Ignorable="w14 w15 w16se w16cid w16 w16cex w16sdtdh w16sdtfl w16du wp14">
   <w:p>
     <w:pPr>
       <w:pStyle w:val="Encabezado"/>
@@ -2910,7 +3102,7 @@
 </file>
 
 <file path=word/numbering.xml><?xml version="1.0" encoding="utf-8"?>
-<w:numbering xmlns:wpc="http://schemas.microsoft.com/office/word/2010/wordprocessingCanvas" xmlns:cx="http://schemas.microsoft.com/office/drawing/2014/chartex" xmlns:cx1="http://schemas.microsoft.com/office/drawing/2015/9/8/chartex" xmlns:cx2="http://schemas.microsoft.com/office/drawing/2015/10/21/chartex" xmlns:cx3="http://schemas.microsoft.com/office/drawing/2016/5/9/chartex" xmlns:cx4="http://schemas.microsoft.com/office/drawing/2016/5/10/chartex" xmlns:cx5="http://schemas.microsoft.com/office/drawing/2016/5/11/chartex" xmlns:cx6="http://schemas.microsoft.com/office/drawing/2016/5/12/chartex" xmlns:cx7="http://schemas.microsoft.com/office/drawing/2016/5/13/chartex" xmlns:cx8="http://schemas.microsoft.com/office/drawing/2016/5/14/chartex" xmlns:mc="http://schemas.openxmlformats.org/markup-compatibility/2006" xmlns:m="http://schemas.openxmlformats.org/officeDocument/2006/math" xmlns:aink="http://schemas.microsoft.com/office/drawing/2016/ink" xmlns:am3d="http://schemas.microsoft.com/office/drawing/2017/model3d" xmlns:oel="http://schemas.microsoft.com/office/2019/extlst" xmlns:r="http://schemas.openxmlformats.org/officeDocument/2006/relationships" xmlns:wp14="http://schemas.microsoft.com/office/word/2010/wordprocessingDrawing" xmlns:wp="http://schemas.openxmlformats.org/drawingml/2006/wordprocessingDrawing" xmlns:wpg="http://schemas.microsoft.com/office/word/2010/wordprocessingGroup" xmlns:wpi="http://schemas.microsoft.com/office/word/2010/wordprocessingInk" xmlns:wps="http://schemas.microsoft.com/office/word/2010/wordprocessingShape" xmlns:o="urn:schemas-microsoft-com:office:office" xmlns:v="urn:schemas-microsoft-com:vml" xmlns:w10="urn:schemas-microsoft-com:office:word" xmlns:w="http://schemas.openxmlformats.org/wordprocessingml/2006/main" xmlns:w14="http://schemas.microsoft.com/office/word/2010/wordml" xmlns:w15="http://schemas.microsoft.com/office/word/2012/wordml" xmlns:w16cex="http://schemas.microsoft.com/office/word/2018/wordml/cex" xmlns:w16cid="http://schemas.microsoft.com/office/word/2016/wordml/cid" xmlns:w16="http://schemas.microsoft.com/office/word/2018/wordml" xmlns:w16sdtdh="http://schemas.microsoft.com/office/word/2020/wordml/sdtdatahash" xmlns:w16sdtfl="http://schemas.microsoft.com/office/word/2024/wordml/sdtformatlock" xmlns:w16se="http://schemas.microsoft.com/office/word/2015/wordml/symex" xmlns:w16du="http://schemas.microsoft.com/office/word/2023/wordml/word16du" xmlns:wne="http://schemas.microsoft.com/office/word/2006/wordml" mc:Ignorable="w14 w15 w16se w16cid w16 w16cex w16sdtdh w16sdtfl w16du wp14">
+<w:numbering xmlns:wpc="http://schemas.microsoft.com/office/word/2010/wordprocessingCanvas" xmlns:cx="http://schemas.microsoft.com/office/drawing/2014/chartex" xmlns:cx1="http://schemas.microsoft.com/office/drawing/2015/9/8/chartex" xmlns:cx2="http://schemas.microsoft.com/office/drawing/2015/10/21/chartex" xmlns:cx3="http://schemas.microsoft.com/office/drawing/2016/5/9/chartex" xmlns:cx4="http://schemas.microsoft.com/office/drawing/2016/5/10/chartex" xmlns:cx5="http://schemas.microsoft.com/office/drawing/2016/5/11/chartex" xmlns:cx6="http://schemas.microsoft.com/office/drawing/2016/5/12/chartex" xmlns:cx7="http://schemas.microsoft.com/office/drawing/2016/5/13/chartex" xmlns:cx8="http://schemas.microsoft.com/office/drawing/2016/5/14/chartex" xmlns:mc="http://schemas.openxmlformats.org/markup-compatibility/2006" xmlns:aink="http://schemas.microsoft.com/office/drawing/2016/ink" xmlns:am3d="http://schemas.microsoft.com/office/drawing/2017/model3d" xmlns:o="urn:schemas-microsoft-com:office:office" xmlns:oel="http://schemas.microsoft.com/office/2019/extlst" xmlns:r="http://schemas.openxmlformats.org/officeDocument/2006/relationships" xmlns:m="http://schemas.openxmlformats.org/officeDocument/2006/math" xmlns:v="urn:schemas-microsoft-com:vml" xmlns:wp14="http://schemas.microsoft.com/office/word/2010/wordprocessingDrawing" xmlns:wp="http://schemas.openxmlformats.org/drawingml/2006/wordprocessingDrawing" xmlns:w10="urn:schemas-microsoft-com:office:word" xmlns:w="http://schemas.openxmlformats.org/wordprocessingml/2006/main" xmlns:w14="http://schemas.microsoft.com/office/word/2010/wordml" xmlns:w15="http://schemas.microsoft.com/office/word/2012/wordml" xmlns:w16cex="http://schemas.microsoft.com/office/word/2018/wordml/cex" xmlns:w16cid="http://schemas.microsoft.com/office/word/2016/wordml/cid" xmlns:w16="http://schemas.microsoft.com/office/word/2018/wordml" xmlns:w16du="http://schemas.microsoft.com/office/word/2023/wordml/word16du" xmlns:w16sdtdh="http://schemas.microsoft.com/office/word/2020/wordml/sdtdatahash" xmlns:w16sdtfl="http://schemas.microsoft.com/office/word/2024/wordml/sdtformatlock" xmlns:w16se="http://schemas.microsoft.com/office/word/2015/wordml/symex" xmlns:wpg="http://schemas.microsoft.com/office/word/2010/wordprocessingGroup" xmlns:wpi="http://schemas.microsoft.com/office/word/2010/wordprocessingInk" xmlns:wne="http://schemas.microsoft.com/office/word/2006/wordml" xmlns:wps="http://schemas.microsoft.com/office/word/2010/wordprocessingShape" mc:Ignorable="w14 w15 w16se w16cid w16 w16cex w16sdtdh w16sdtfl w16du wp14">
   <w:abstractNum w:abstractNumId="0" w15:restartNumberingAfterBreak="0">
     <w:nsid w:val="042A6B37"/>
     <w:multiLevelType w:val="hybridMultilevel"/>
@@ -4353,7 +4545,7 @@
 </file>
 
 <file path=word/styles.xml><?xml version="1.0" encoding="utf-8"?>
-<w:styles xmlns:mc="http://schemas.openxmlformats.org/markup-compatibility/2006" xmlns:r="http://schemas.openxmlformats.org/officeDocument/2006/relationships" xmlns:w="http://schemas.openxmlformats.org/wordprocessingml/2006/main" xmlns:w14="http://schemas.microsoft.com/office/word/2010/wordml" xmlns:w15="http://schemas.microsoft.com/office/word/2012/wordml" xmlns:w16cex="http://schemas.microsoft.com/office/word/2018/wordml/cex" xmlns:w16cid="http://schemas.microsoft.com/office/word/2016/wordml/cid" xmlns:w16="http://schemas.microsoft.com/office/word/2018/wordml" xmlns:w16sdtdh="http://schemas.microsoft.com/office/word/2020/wordml/sdtdatahash" xmlns:w16sdtfl="http://schemas.microsoft.com/office/word/2024/wordml/sdtformatlock" xmlns:w16se="http://schemas.microsoft.com/office/word/2015/wordml/symex" xmlns:w16du="http://schemas.microsoft.com/office/word/2023/wordml/word16du" mc:Ignorable="w14 w15 w16se w16cid w16 w16cex w16sdtdh w16sdtfl w16du">
+<w:styles xmlns:mc="http://schemas.openxmlformats.org/markup-compatibility/2006" xmlns:r="http://schemas.openxmlformats.org/officeDocument/2006/relationships" xmlns:w="http://schemas.openxmlformats.org/wordprocessingml/2006/main" xmlns:w14="http://schemas.microsoft.com/office/word/2010/wordml" xmlns:w15="http://schemas.microsoft.com/office/word/2012/wordml" xmlns:w16cex="http://schemas.microsoft.com/office/word/2018/wordml/cex" xmlns:w16cid="http://schemas.microsoft.com/office/word/2016/wordml/cid" xmlns:w16="http://schemas.microsoft.com/office/word/2018/wordml" xmlns:w16du="http://schemas.microsoft.com/office/word/2023/wordml/word16du" xmlns:w16sdtdh="http://schemas.microsoft.com/office/word/2020/wordml/sdtdatahash" xmlns:w16sdtfl="http://schemas.microsoft.com/office/word/2024/wordml/sdtformatlock" xmlns:w16se="http://schemas.microsoft.com/office/word/2015/wordml/symex" mc:Ignorable="w14 w15 w16se w16cid w16 w16cex w16sdtdh w16sdtfl w16du">
   <w:docDefaults>
     <w:rPrDefault>
       <w:rPr>
@@ -5571,7 +5763,7 @@
 </file>
 
 <file path=word/glossary/document.xml><?xml version="1.0" encoding="utf-8"?>
-<w:glossaryDocument xmlns:wpc="http://schemas.microsoft.com/office/word/2010/wordprocessingCanvas" xmlns:cx="http://schemas.microsoft.com/office/drawing/2014/chartex" xmlns:cx1="http://schemas.microsoft.com/office/drawing/2015/9/8/chartex" xmlns:cx2="http://schemas.microsoft.com/office/drawing/2015/10/21/chartex" xmlns:cx3="http://schemas.microsoft.com/office/drawing/2016/5/9/chartex" xmlns:cx4="http://schemas.microsoft.com/office/drawing/2016/5/10/chartex" xmlns:cx5="http://schemas.microsoft.com/office/drawing/2016/5/11/chartex" xmlns:cx6="http://schemas.microsoft.com/office/drawing/2016/5/12/chartex" xmlns:cx7="http://schemas.microsoft.com/office/drawing/2016/5/13/chartex" xmlns:cx8="http://schemas.microsoft.com/office/drawing/2016/5/14/chartex" xmlns:mc="http://schemas.openxmlformats.org/markup-compatibility/2006" xmlns:m="http://schemas.openxmlformats.org/officeDocument/2006/math" xmlns:aink="http://schemas.microsoft.com/office/drawing/2016/ink" xmlns:am3d="http://schemas.microsoft.com/office/drawing/2017/model3d" xmlns:oel="http://schemas.microsoft.com/office/2019/extlst" xmlns:r="http://schemas.openxmlformats.org/officeDocument/2006/relationships" xmlns:wp14="http://schemas.microsoft.com/office/word/2010/wordprocessingDrawing" xmlns:wp="http://schemas.openxmlformats.org/drawingml/2006/wordprocessingDrawing" xmlns:wpg="http://schemas.microsoft.com/office/word/2010/wordprocessingGroup" xmlns:wpi="http://schemas.microsoft.com/office/word/2010/wordprocessingInk" xmlns:wps="http://schemas.microsoft.com/office/word/2010/wordprocessingShape" xmlns:o="urn:schemas-microsoft-com:office:office" xmlns:v="urn:schemas-microsoft-com:vml" xmlns:w10="urn:schemas-microsoft-com:office:word" xmlns:w="http://schemas.openxmlformats.org/wordprocessingml/2006/main" xmlns:w14="http://schemas.microsoft.com/office/word/2010/wordml" xmlns:w15="http://schemas.microsoft.com/office/word/2012/wordml" xmlns:w16cex="http://schemas.microsoft.com/office/word/2018/wordml/cex" xmlns:w16cid="http://schemas.microsoft.com/office/word/2016/wordml/cid" xmlns:w16="http://schemas.microsoft.com/office/word/2018/wordml" xmlns:w16sdtdh="http://schemas.microsoft.com/office/word/2020/wordml/sdtdatahash" xmlns:w16sdtfl="http://schemas.microsoft.com/office/word/2024/wordml/sdtformatlock" xmlns:w16se="http://schemas.microsoft.com/office/word/2015/wordml/symex" xmlns:w16du="http://schemas.microsoft.com/office/word/2023/wordml/word16du" xmlns:wne="http://schemas.microsoft.com/office/word/2006/wordml" mc:Ignorable="w14 w15 w16se w16cid w16 w16cex w16sdtdh w16sdtfl w16du wp14">
+<w:glossaryDocument xmlns:wpc="http://schemas.microsoft.com/office/word/2010/wordprocessingCanvas" xmlns:cx="http://schemas.microsoft.com/office/drawing/2014/chartex" xmlns:cx1="http://schemas.microsoft.com/office/drawing/2015/9/8/chartex" xmlns:cx2="http://schemas.microsoft.com/office/drawing/2015/10/21/chartex" xmlns:cx3="http://schemas.microsoft.com/office/drawing/2016/5/9/chartex" xmlns:cx4="http://schemas.microsoft.com/office/drawing/2016/5/10/chartex" xmlns:cx5="http://schemas.microsoft.com/office/drawing/2016/5/11/chartex" xmlns:cx6="http://schemas.microsoft.com/office/drawing/2016/5/12/chartex" xmlns:cx7="http://schemas.microsoft.com/office/drawing/2016/5/13/chartex" xmlns:cx8="http://schemas.microsoft.com/office/drawing/2016/5/14/chartex" xmlns:mc="http://schemas.openxmlformats.org/markup-compatibility/2006" xmlns:aink="http://schemas.microsoft.com/office/drawing/2016/ink" xmlns:am3d="http://schemas.microsoft.com/office/drawing/2017/model3d" xmlns:o="urn:schemas-microsoft-com:office:office" xmlns:oel="http://schemas.microsoft.com/office/2019/extlst" xmlns:r="http://schemas.openxmlformats.org/officeDocument/2006/relationships" xmlns:m="http://schemas.openxmlformats.org/officeDocument/2006/math" xmlns:v="urn:schemas-microsoft-com:vml" xmlns:wp14="http://schemas.microsoft.com/office/word/2010/wordprocessingDrawing" xmlns:wp="http://schemas.openxmlformats.org/drawingml/2006/wordprocessingDrawing" xmlns:w10="urn:schemas-microsoft-com:office:word" xmlns:w="http://schemas.openxmlformats.org/wordprocessingml/2006/main" xmlns:w14="http://schemas.microsoft.com/office/word/2010/wordml" xmlns:w15="http://schemas.microsoft.com/office/word/2012/wordml" xmlns:w16cex="http://schemas.microsoft.com/office/word/2018/wordml/cex" xmlns:w16cid="http://schemas.microsoft.com/office/word/2016/wordml/cid" xmlns:w16="http://schemas.microsoft.com/office/word/2018/wordml" xmlns:w16du="http://schemas.microsoft.com/office/word/2023/wordml/word16du" xmlns:w16sdtdh="http://schemas.microsoft.com/office/word/2020/wordml/sdtdatahash" xmlns:w16sdtfl="http://schemas.microsoft.com/office/word/2024/wordml/sdtformatlock" xmlns:w16se="http://schemas.microsoft.com/office/word/2015/wordml/symex" xmlns:wpg="http://schemas.microsoft.com/office/word/2010/wordprocessingGroup" xmlns:wpi="http://schemas.microsoft.com/office/word/2010/wordprocessingInk" xmlns:wne="http://schemas.microsoft.com/office/word/2006/wordml" xmlns:wps="http://schemas.microsoft.com/office/word/2010/wordprocessingShape" mc:Ignorable="w14 w15 w16se w16cid w16 w16cex w16sdtdh w16sdtfl w16du wp14">
   <w:docParts>
     <w:docPart>
       <w:docPartPr>
@@ -5641,7 +5833,7 @@
 </file>
 
 <file path=word/glossary/fontTable.xml><?xml version="1.0" encoding="utf-8"?>
-<w:fonts xmlns:mc="http://schemas.openxmlformats.org/markup-compatibility/2006" xmlns:r="http://schemas.openxmlformats.org/officeDocument/2006/relationships" xmlns:w="http://schemas.openxmlformats.org/wordprocessingml/2006/main" xmlns:w14="http://schemas.microsoft.com/office/word/2010/wordml" xmlns:w15="http://schemas.microsoft.com/office/word/2012/wordml" xmlns:w16cex="http://schemas.microsoft.com/office/word/2018/wordml/cex" xmlns:w16cid="http://schemas.microsoft.com/office/word/2016/wordml/cid" xmlns:w16="http://schemas.microsoft.com/office/word/2018/wordml" xmlns:w16sdtdh="http://schemas.microsoft.com/office/word/2020/wordml/sdtdatahash" xmlns:w16sdtfl="http://schemas.microsoft.com/office/word/2024/wordml/sdtformatlock" xmlns:w16se="http://schemas.microsoft.com/office/word/2015/wordml/symex" xmlns:w16du="http://schemas.microsoft.com/office/word/2023/wordml/word16du" mc:Ignorable="w14 w15 w16se w16cid w16 w16cex w16sdtdh w16sdtfl w16du">
+<w:fonts xmlns:mc="http://schemas.openxmlformats.org/markup-compatibility/2006" xmlns:r="http://schemas.openxmlformats.org/officeDocument/2006/relationships" xmlns:w="http://schemas.openxmlformats.org/wordprocessingml/2006/main" xmlns:w14="http://schemas.microsoft.com/office/word/2010/wordml" xmlns:w15="http://schemas.microsoft.com/office/word/2012/wordml" xmlns:w16cex="http://schemas.microsoft.com/office/word/2018/wordml/cex" xmlns:w16cid="http://schemas.microsoft.com/office/word/2016/wordml/cid" xmlns:w16="http://schemas.microsoft.com/office/word/2018/wordml" xmlns:w16du="http://schemas.microsoft.com/office/word/2023/wordml/word16du" xmlns:w16sdtdh="http://schemas.microsoft.com/office/word/2020/wordml/sdtdatahash" xmlns:w16sdtfl="http://schemas.microsoft.com/office/word/2024/wordml/sdtformatlock" xmlns:w16se="http://schemas.microsoft.com/office/word/2015/wordml/symex" mc:Ignorable="w14 w15 w16se w16cid w16 w16cex w16sdtdh w16sdtfl w16du">
   <w:font w:name="Times New Roman">
     <w:panose1 w:val="02020603050405020304"/>
     <w:charset w:val="00"/>
@@ -5652,7 +5844,7 @@
   <w:font w:name="Symbol">
     <w:panose1 w:val="05050102010706020507"/>
     <w:charset w:val="02"/>
-    <w:family w:val="decorative"/>
+    <w:family w:val="roman"/>
     <w:pitch w:val="variable"/>
     <w:sig w:usb0="00000000" w:usb1="10000000" w:usb2="00000000" w:usb3="00000000" w:csb0="80000000" w:csb1="00000000"/>
   </w:font>
@@ -5665,10 +5857,10 @@
   </w:font>
   <w:font w:name="Wingdings">
     <w:panose1 w:val="05000000000000000000"/>
-    <w:charset w:val="4D"/>
-    <w:family w:val="decorative"/>
+    <w:charset w:val="02"/>
+    <w:family w:val="auto"/>
     <w:pitch w:val="variable"/>
-    <w:sig w:usb0="00000003" w:usb1="00000000" w:usb2="00000000" w:usb3="00000000" w:csb0="80000001" w:csb1="00000000"/>
+    <w:sig w:usb0="00000000" w:usb1="10000000" w:usb2="00000000" w:usb3="00000000" w:csb0="80000000" w:csb1="00000000"/>
   </w:font>
   <w:font w:name="Calibri">
     <w:panose1 w:val="020F0502020204030204"/>
@@ -5697,7 +5889,7 @@
     <w:charset w:val="00"/>
     <w:family w:val="swiss"/>
     <w:pitch w:val="variable"/>
-    <w:sig w:usb0="E0002AFF" w:usb1="C0007843" w:usb2="00000009" w:usb3="00000000" w:csb0="000001FF" w:csb1="00000000"/>
+    <w:sig w:usb0="E0002EFF" w:usb1="C000785B" w:usb2="00000009" w:usb3="00000000" w:csb0="000001FF" w:csb1="00000000"/>
   </w:font>
   <w:font w:name="Tahoma">
     <w:panose1 w:val="020B0604030504040204"/>
@@ -5707,7 +5899,6 @@
     <w:sig w:usb0="E1002EFF" w:usb1="C000605B" w:usb2="00000029" w:usb3="00000000" w:csb0="000101FF" w:csb1="00000000"/>
   </w:font>
   <w:font w:name="MS Mincho">
-    <w:altName w:val="ＭＳ 明朝"/>
     <w:panose1 w:val="02020609040205080304"/>
     <w:charset w:val="80"/>
     <w:family w:val="modern"/>
@@ -5715,23 +5906,19 @@
     <w:sig w:usb0="E00002FF" w:usb1="6AC7FDFB" w:usb2="08000012" w:usb3="00000000" w:csb0="0002009F" w:csb1="00000000"/>
   </w:font>
   <w:font w:name="Aptos">
-    <w:panose1 w:val="020B0004020202020204"/>
     <w:charset w:val="00"/>
     <w:family w:val="swiss"/>
     <w:pitch w:val="variable"/>
     <w:sig w:usb0="20000287" w:usb1="00000003" w:usb2="00000000" w:usb3="00000000" w:csb0="0000019F" w:csb1="00000000"/>
   </w:font>
   <w:font w:name="Yu Mincho">
-    <w:panose1 w:val="02020400000000000000"/>
     <w:charset w:val="80"/>
     <w:family w:val="roman"/>
-    <w:notTrueType/>
     <w:pitch w:val="variable"/>
     <w:sig w:usb0="800002E7" w:usb1="2AC7FCFF" w:usb2="00000012" w:usb3="00000000" w:csb0="0002009F" w:csb1="00000000"/>
   </w:font>
   <w:font w:name="Aptos Display">
-    <w:panose1 w:val="020B0004020202020204"/>
-    <w:charset w:val="01"/>
+    <w:charset w:val="00"/>
     <w:family w:val="swiss"/>
     <w:pitch w:val="variable"/>
     <w:sig w:usb0="20000287" w:usb1="00000003" w:usb2="00000000" w:usb3="00000000" w:csb0="0000019F" w:csb1="00000000"/>
@@ -5747,7 +5934,7 @@
 </file>
 
 <file path=word/glossary/settings.xml><?xml version="1.0" encoding="utf-8"?>
-<w:settings xmlns:mc="http://schemas.openxmlformats.org/markup-compatibility/2006" xmlns:m="http://schemas.openxmlformats.org/officeDocument/2006/math" xmlns:r="http://schemas.openxmlformats.org/officeDocument/2006/relationships" xmlns:sl="http://schemas.openxmlformats.org/schemaLibrary/2006/main" xmlns:o="urn:schemas-microsoft-com:office:office" xmlns:v="urn:schemas-microsoft-com:vml" xmlns:w10="urn:schemas-microsoft-com:office:word" xmlns:w="http://schemas.openxmlformats.org/wordprocessingml/2006/main" xmlns:w14="http://schemas.microsoft.com/office/word/2010/wordml" xmlns:w15="http://schemas.microsoft.com/office/word/2012/wordml" xmlns:w16cex="http://schemas.microsoft.com/office/word/2018/wordml/cex" xmlns:w16cid="http://schemas.microsoft.com/office/word/2016/wordml/cid" xmlns:w16="http://schemas.microsoft.com/office/word/2018/wordml" xmlns:w16sdtdh="http://schemas.microsoft.com/office/word/2020/wordml/sdtdatahash" xmlns:w16sdtfl="http://schemas.microsoft.com/office/word/2024/wordml/sdtformatlock" xmlns:w16se="http://schemas.microsoft.com/office/word/2015/wordml/symex" xmlns:w16du="http://schemas.microsoft.com/office/word/2023/wordml/word16du" mc:Ignorable="w14 w15 w16se w16cid w16 w16cex w16sdtdh w16sdtfl w16du">
+<w:settings xmlns:mc="http://schemas.openxmlformats.org/markup-compatibility/2006" xmlns:o="urn:schemas-microsoft-com:office:office" xmlns:r="http://schemas.openxmlformats.org/officeDocument/2006/relationships" xmlns:m="http://schemas.openxmlformats.org/officeDocument/2006/math" xmlns:v="urn:schemas-microsoft-com:vml" xmlns:w10="urn:schemas-microsoft-com:office:word" xmlns:w="http://schemas.openxmlformats.org/wordprocessingml/2006/main" xmlns:w14="http://schemas.microsoft.com/office/word/2010/wordml" xmlns:w15="http://schemas.microsoft.com/office/word/2012/wordml" xmlns:w16cex="http://schemas.microsoft.com/office/word/2018/wordml/cex" xmlns:w16cid="http://schemas.microsoft.com/office/word/2016/wordml/cid" xmlns:w16="http://schemas.microsoft.com/office/word/2018/wordml" xmlns:w16du="http://schemas.microsoft.com/office/word/2023/wordml/word16du" xmlns:w16sdtdh="http://schemas.microsoft.com/office/word/2020/wordml/sdtdatahash" xmlns:w16sdtfl="http://schemas.microsoft.com/office/word/2024/wordml/sdtformatlock" xmlns:w16se="http://schemas.microsoft.com/office/word/2015/wordml/symex" xmlns:sl="http://schemas.openxmlformats.org/schemaLibrary/2006/main" mc:Ignorable="w14 w15 w16se w16cid w16 w16cex w16sdtdh w16sdtfl w16du">
   <w:view w:val="normal"/>
   <w:defaultTabStop w:val="708"/>
   <w:hyphenationZone w:val="425"/>
@@ -5764,6 +5951,7 @@
     <w:rsid w:val="00153A14"/>
     <w:rsid w:val="00194DF5"/>
     <w:rsid w:val="001B14B7"/>
+    <w:rsid w:val="001E0B2D"/>
     <w:rsid w:val="002835FC"/>
     <w:rsid w:val="002C06A7"/>
     <w:rsid w:val="004F7F49"/>
@@ -5772,6 +5960,7 @@
     <w:rsid w:val="005B27DB"/>
     <w:rsid w:val="006E2FCC"/>
     <w:rsid w:val="00704192"/>
+    <w:rsid w:val="007F44F5"/>
     <w:rsid w:val="00825B36"/>
     <w:rsid w:val="00960213"/>
     <w:rsid w:val="00AE6FE7"/>
@@ -5804,7 +5993,7 @@
 </file>
 
 <file path=word/glossary/styles.xml><?xml version="1.0" encoding="utf-8"?>
-<w:styles xmlns:mc="http://schemas.openxmlformats.org/markup-compatibility/2006" xmlns:r="http://schemas.openxmlformats.org/officeDocument/2006/relationships" xmlns:w="http://schemas.openxmlformats.org/wordprocessingml/2006/main" xmlns:w14="http://schemas.microsoft.com/office/word/2010/wordml" xmlns:w15="http://schemas.microsoft.com/office/word/2012/wordml" xmlns:w16cex="http://schemas.microsoft.com/office/word/2018/wordml/cex" xmlns:w16cid="http://schemas.microsoft.com/office/word/2016/wordml/cid" xmlns:w16="http://schemas.microsoft.com/office/word/2018/wordml" xmlns:w16sdtdh="http://schemas.microsoft.com/office/word/2020/wordml/sdtdatahash" xmlns:w16sdtfl="http://schemas.microsoft.com/office/word/2024/wordml/sdtformatlock" xmlns:w16se="http://schemas.microsoft.com/office/word/2015/wordml/symex" xmlns:w16du="http://schemas.microsoft.com/office/word/2023/wordml/word16du" mc:Ignorable="w14 w15 w16se w16cid w16 w16cex w16sdtdh w16sdtfl w16du">
+<w:styles xmlns:mc="http://schemas.openxmlformats.org/markup-compatibility/2006" xmlns:r="http://schemas.openxmlformats.org/officeDocument/2006/relationships" xmlns:w="http://schemas.openxmlformats.org/wordprocessingml/2006/main" xmlns:w14="http://schemas.microsoft.com/office/word/2010/wordml" xmlns:w15="http://schemas.microsoft.com/office/word/2012/wordml" xmlns:w16cex="http://schemas.microsoft.com/office/word/2018/wordml/cex" xmlns:w16cid="http://schemas.microsoft.com/office/word/2016/wordml/cid" xmlns:w16="http://schemas.microsoft.com/office/word/2018/wordml" xmlns:w16du="http://schemas.microsoft.com/office/word/2023/wordml/word16du" xmlns:w16sdtdh="http://schemas.microsoft.com/office/word/2020/wordml/sdtdatahash" xmlns:w16sdtfl="http://schemas.microsoft.com/office/word/2024/wordml/sdtformatlock" xmlns:w16se="http://schemas.microsoft.com/office/word/2015/wordml/symex" mc:Ignorable="w14 w15 w16se w16cid w16 w16cex w16sdtdh w16sdtfl w16du">
   <w:docDefaults>
     <w:rPrDefault>
       <w:rPr>
@@ -6233,7 +6422,7 @@
 </file>
 
 <file path=word/glossary/webSettings.xml><?xml version="1.0" encoding="utf-8"?>
-<w:webSettings xmlns:mc="http://schemas.openxmlformats.org/markup-compatibility/2006" xmlns:r="http://schemas.openxmlformats.org/officeDocument/2006/relationships" xmlns:w="http://schemas.openxmlformats.org/wordprocessingml/2006/main" xmlns:w14="http://schemas.microsoft.com/office/word/2010/wordml" xmlns:w15="http://schemas.microsoft.com/office/word/2012/wordml" xmlns:w16cex="http://schemas.microsoft.com/office/word/2018/wordml/cex" xmlns:w16cid="http://schemas.microsoft.com/office/word/2016/wordml/cid" xmlns:w16="http://schemas.microsoft.com/office/word/2018/wordml" xmlns:w16sdtdh="http://schemas.microsoft.com/office/word/2020/wordml/sdtdatahash" xmlns:w16sdtfl="http://schemas.microsoft.com/office/word/2024/wordml/sdtformatlock" xmlns:w16se="http://schemas.microsoft.com/office/word/2015/wordml/symex" xmlns:w16du="http://schemas.microsoft.com/office/word/2023/wordml/word16du" mc:Ignorable="w14 w15 w16se w16cid w16 w16cex w16sdtdh w16sdtfl w16du">
+<w:webSettings xmlns:mc="http://schemas.openxmlformats.org/markup-compatibility/2006" xmlns:r="http://schemas.openxmlformats.org/officeDocument/2006/relationships" xmlns:w="http://schemas.openxmlformats.org/wordprocessingml/2006/main" xmlns:w14="http://schemas.microsoft.com/office/word/2010/wordml" xmlns:w15="http://schemas.microsoft.com/office/word/2012/wordml" xmlns:w16cex="http://schemas.microsoft.com/office/word/2018/wordml/cex" xmlns:w16cid="http://schemas.microsoft.com/office/word/2016/wordml/cid" xmlns:w16="http://schemas.microsoft.com/office/word/2018/wordml" xmlns:w16du="http://schemas.microsoft.com/office/word/2023/wordml/word16du" xmlns:w16sdtdh="http://schemas.microsoft.com/office/word/2020/wordml/sdtdatahash" xmlns:w16sdtfl="http://schemas.microsoft.com/office/word/2024/wordml/sdtformatlock" xmlns:w16se="http://schemas.microsoft.com/office/word/2015/wordml/symex" mc:Ignorable="w14 w15 w16se w16cid w16 w16cex w16sdtdh w16sdtfl w16du">
   <w:optimizeForBrowser/>
 </w:webSettings>
 </file>
@@ -6523,7 +6712,7 @@
 
 <file path=customXml/item1.xml><?xml version="1.0" encoding="utf-8"?>
 <CoverPageProperties xmlns="http://schemas.microsoft.com/office/2006/coverPageProps">
-  <PublishDate/>
+  <PublishDate>2026-10-14T00:00:00</PublishDate>
   <Abstract>Documento de Diseño basado en UML</Abstract>
   <CompanyAddress/>
   <CompanyPhone/>
@@ -6533,20 +6722,6 @@
 </file>
 
 <file path=customXml/item2.xml><?xml version="1.0" encoding="utf-8"?>
-<p:properties xmlns:p="http://schemas.microsoft.com/office/2006/metadata/properties" xmlns:xsi="http://www.w3.org/2001/XMLSchema-instance" xmlns:pc="http://schemas.microsoft.com/office/infopath/2007/PartnerControls">
-  <documentManagement>
-    <lcf76f155ced4ddcb4097134ff3c332f xmlns="e1e7bc46-bed0-459f-9452-a76b1c5b695e">
-      <Terms xmlns="http://schemas.microsoft.com/office/infopath/2007/PartnerControls"/>
-    </lcf76f155ced4ddcb4097134ff3c332f>
-  </documentManagement>
-</p:properties>
-</file>
-
-<file path=customXml/item3.xml><?xml version="1.0" encoding="utf-8"?>
-<b:Sources xmlns:b="http://schemas.openxmlformats.org/officeDocument/2006/bibliography" xmlns="http://schemas.openxmlformats.org/officeDocument/2006/bibliography" SelectedStyle="\APA.XSL" StyleName="APA"/>
-</file>
-
-<file path=customXml/item4.xml><?xml version="1.0" encoding="utf-8"?>
 <ct:contentTypeSchema xmlns:ct="http://schemas.microsoft.com/office/2006/metadata/contentType" xmlns:ma="http://schemas.microsoft.com/office/2006/metadata/properties/metaAttributes" ct:_="" ma:_="" ma:contentTypeName="Documento" ma:contentTypeID="0x0101005395107FFD641345A10C8A5ACACB9D20" ma:contentTypeVersion="13" ma:contentTypeDescription="Crear nuevo documento." ma:contentTypeScope="" ma:versionID="7407f70e7181b908656026f379795b2c">
   <xsd:schema xmlns:xsd="http://www.w3.org/2001/XMLSchema" xmlns:xs="http://www.w3.org/2001/XMLSchema" xmlns:p="http://schemas.microsoft.com/office/2006/metadata/properties" xmlns:ns2="e1e7bc46-bed0-459f-9452-a76b1c5b695e" xmlns:ns3="bb8cf7e1-610f-40a0-8f00-126b9d139fde" targetNamespace="http://schemas.microsoft.com/office/2006/metadata/properties" ma:root="true" ma:fieldsID="b29ea8901729e1eaaa4e48e09148c760" ns2:_="" ns3:_="">
     <xsd:import namespace="e1e7bc46-bed0-459f-9452-a76b1c5b695e"/>
@@ -6763,6 +6938,20 @@
 </ct:contentTypeSchema>
 </file>
 
+<file path=customXml/item3.xml><?xml version="1.0" encoding="utf-8"?>
+<b:Sources xmlns:b="http://schemas.openxmlformats.org/officeDocument/2006/bibliography" xmlns="http://schemas.openxmlformats.org/officeDocument/2006/bibliography" SelectedStyle="\APA.XSL" StyleName="APA"/>
+</file>
+
+<file path=customXml/item4.xml><?xml version="1.0" encoding="utf-8"?>
+<p:properties xmlns:p="http://schemas.microsoft.com/office/2006/metadata/properties" xmlns:xsi="http://www.w3.org/2001/XMLSchema-instance" xmlns:pc="http://schemas.microsoft.com/office/infopath/2007/PartnerControls">
+  <documentManagement>
+    <lcf76f155ced4ddcb4097134ff3c332f xmlns="e1e7bc46-bed0-459f-9452-a76b1c5b695e">
+      <Terms xmlns="http://schemas.microsoft.com/office/infopath/2007/PartnerControls"/>
+    </lcf76f155ced4ddcb4097134ff3c332f>
+  </documentManagement>
+</p:properties>
+</file>
+
 <file path=customXml/item5.xml><?xml version="1.0" encoding="utf-8"?>
 <?mso-contentType ?>
 <FormTemplates xmlns="http://schemas.microsoft.com/sharepoint/v3/contenttype/forms">
@@ -6781,24 +6970,6 @@
 </file>
 
 <file path=customXml/itemProps2.xml><?xml version="1.0" encoding="utf-8"?>
-<ds:datastoreItem xmlns:ds="http://schemas.openxmlformats.org/officeDocument/2006/customXml" ds:itemID="{E1036DFC-1D85-404D-898C-621D06C0EB1C}">
-  <ds:schemaRefs>
-    <ds:schemaRef ds:uri="http://schemas.microsoft.com/office/2006/metadata/properties"/>
-    <ds:schemaRef ds:uri="http://schemas.microsoft.com/office/infopath/2007/PartnerControls"/>
-    <ds:schemaRef ds:uri="e1e7bc46-bed0-459f-9452-a76b1c5b695e"/>
-  </ds:schemaRefs>
-</ds:datastoreItem>
-</file>
-
-<file path=customXml/itemProps3.xml><?xml version="1.0" encoding="utf-8"?>
-<ds:datastoreItem xmlns:ds="http://schemas.openxmlformats.org/officeDocument/2006/customXml" ds:itemID="{BD6EC776-6679-4C69-98E3-6D068EA0A3C9}">
-  <ds:schemaRefs>
-    <ds:schemaRef ds:uri="http://schemas.openxmlformats.org/officeDocument/2006/bibliography"/>
-  </ds:schemaRefs>
-</ds:datastoreItem>
-</file>
-
-<file path=customXml/itemProps4.xml><?xml version="1.0" encoding="utf-8"?>
 <ds:datastoreItem xmlns:ds="http://schemas.openxmlformats.org/officeDocument/2006/customXml" ds:itemID="{444115BD-C1C6-48AD-B714-E1866627071D}">
   <ds:schemaRefs>
     <ds:schemaRef ds:uri="http://schemas.microsoft.com/office/2006/metadata/contentType"/>
@@ -6817,6 +6988,24 @@
 </ds:datastoreItem>
 </file>
 
+<file path=customXml/itemProps3.xml><?xml version="1.0" encoding="utf-8"?>
+<ds:datastoreItem xmlns:ds="http://schemas.openxmlformats.org/officeDocument/2006/customXml" ds:itemID="{BD6EC776-6679-4C69-98E3-6D068EA0A3C9}">
+  <ds:schemaRefs>
+    <ds:schemaRef ds:uri="http://schemas.openxmlformats.org/officeDocument/2006/bibliography"/>
+  </ds:schemaRefs>
+</ds:datastoreItem>
+</file>
+
+<file path=customXml/itemProps4.xml><?xml version="1.0" encoding="utf-8"?>
+<ds:datastoreItem xmlns:ds="http://schemas.openxmlformats.org/officeDocument/2006/customXml" ds:itemID="{E1036DFC-1D85-404D-898C-621D06C0EB1C}">
+  <ds:schemaRefs>
+    <ds:schemaRef ds:uri="http://schemas.microsoft.com/office/2006/metadata/properties"/>
+    <ds:schemaRef ds:uri="http://schemas.microsoft.com/office/infopath/2007/PartnerControls"/>
+    <ds:schemaRef ds:uri="e1e7bc46-bed0-459f-9452-a76b1c5b695e"/>
+  </ds:schemaRefs>
+</ds:datastoreItem>
+</file>
+
 <file path=customXml/itemProps5.xml><?xml version="1.0" encoding="utf-8"?>
 <ds:datastoreItem xmlns:ds="http://schemas.openxmlformats.org/officeDocument/2006/customXml" ds:itemID="{EE9AAF0E-D63F-459F-A0FB-CDCE9F728F33}">
   <ds:schemaRefs>

</xml_diff>